<commit_message>
Update resume and switched to a video of a bike wheel; revise professional summary and experience sections
</commit_message>
<xml_diff>
--- a/doc/Shawn Burgess.docx
+++ b/doc/Shawn Burgess.docx
@@ -116,40 +116,43 @@
           <w:b w:val="1"/>
           <w:rtl w:val="0"/>
         </w:rPr>
-        <w:t xml:space="preserve">OVERVIEW:</w:t>
-      </w:r>
-      <w:r>
-        <w:rPr>
-          <w:rtl w:val="0"/>
-        </w:rPr>
-      </w:r>
-    </w:p>
-    <w:p>
-      <w:pPr>
-        <w:numPr>
-          <w:ilvl w:val="0"/>
-          <w:numId w:val="2"/>
+        <w:t xml:space="preserve">PROFESSIONAL SUMMARY:</w:t>
+      </w:r>
+      <w:r>
+        <w:rPr>
+          <w:rtl w:val="0"/>
+        </w:rPr>
+      </w:r>
+    </w:p>
+    <w:p>
+      <w:pPr>
+        <w:numPr>
+          <w:ilvl w:val="0"/>
+          <w:numId w:val="1"/>
         </w:numPr>
         <w:ind w:left="720" w:hanging="360"/>
         <w:rPr>
-          <w:u w:val="none"/>
-        </w:rPr>
-      </w:pPr>
-      <w:r>
-        <w:rPr>
-          <w:rFonts w:ascii="Calibri" w:cs="Calibri" w:eastAsia="Calibri" w:hAnsi="Calibri"/>
-          <w:sz w:val="24"/>
-          <w:szCs w:val="24"/>
-          <w:rtl w:val="0"/>
-        </w:rPr>
-        <w:t xml:space="preserve">Having spent more than a decade in software engineering and technology leadership roles, I understand the varied needs of organizations across multiple industries and have learned a thing or two about how robust software architecture and user-centered design enable business success. User experience has always been central to my development methodology.</w:t>
-      </w:r>
-    </w:p>
-    <w:p>
-      <w:pPr>
-        <w:numPr>
-          <w:ilvl w:val="0"/>
-          <w:numId w:val="2"/>
+          <w:rFonts w:ascii="Calibri" w:cs="Calibri" w:eastAsia="Calibri" w:hAnsi="Calibri"/>
+          <w:sz w:val="24"/>
+          <w:szCs w:val="24"/>
+          <w:u w:val="none"/>
+        </w:rPr>
+      </w:pPr>
+      <w:r>
+        <w:rPr>
+          <w:rFonts w:ascii="Calibri" w:cs="Calibri" w:eastAsia="Calibri" w:hAnsi="Calibri"/>
+          <w:sz w:val="24"/>
+          <w:szCs w:val="24"/>
+          <w:rtl w:val="0"/>
+        </w:rPr>
+        <w:t xml:space="preserve">Senior Software Engineer specializing in modernization of multi-tenant scientific and enterprise platforms spanning chemistry, biology, registration, workflow, and data-intensive systems. Blend of deep hands-on full-stack delivery (C#, .NET, React, SQL, Java, Python) with architectural stewardship (service boundaries, API contracts, schema evolution, performance &amp; scalability, identity &amp; security). Known for converting legacy monolith &amp; scripting surfaces into tested, observable services, instituting feature flag governance for safe incremental rollouts; and driving measurable reductions in operational friction (faster root cause isolation, lower regression rates, resilient bulk data processing).</w:t>
+      </w:r>
+    </w:p>
+    <w:p>
+      <w:pPr>
+        <w:numPr>
+          <w:ilvl w:val="0"/>
+          <w:numId w:val="1"/>
         </w:numPr>
         <w:ind w:left="720" w:hanging="360"/>
         <w:rPr>
@@ -166,31 +169,63 @@
           <w:szCs w:val="24"/>
           <w:rtl w:val="0"/>
         </w:rPr>
-        <w:t xml:space="preserve">I most recently worked as a Senior Software Developer where I lead technical initiatives and architect scalable solutions using modern technologies like C#, React, and SQL. I am passionate about building strong cross-functional relationships across engineering, product, and business teams. I have a proven track record of leading strategic software projects that deliver value.</w:t>
-      </w:r>
-    </w:p>
-    <w:p>
-      <w:pPr>
-        <w:numPr>
-          <w:ilvl w:val="0"/>
-          <w:numId w:val="2"/>
-        </w:numPr>
-        <w:ind w:left="720" w:hanging="360"/>
-        <w:rPr>
-          <w:rFonts w:ascii="Calibri" w:cs="Calibri" w:eastAsia="Calibri" w:hAnsi="Calibri"/>
-          <w:sz w:val="24"/>
-          <w:szCs w:val="24"/>
-          <w:u w:val="none"/>
-        </w:rPr>
-      </w:pPr>
-      <w:r>
-        <w:rPr>
-          <w:rFonts w:ascii="Calibri" w:cs="Calibri" w:eastAsia="Calibri" w:hAnsi="Calibri"/>
-          <w:sz w:val="24"/>
-          <w:szCs w:val="24"/>
-          <w:rtl w:val="0"/>
-        </w:rPr>
-        <w:t xml:space="preserve">Previously, I have held roles across diverse technology environments, from enterprise insurance applications to life science SaaS platforms, spanning full-stack development, legacy system modernization, and technical leadership. I have continuously evolved my expertise from traditional web development to modern cloud-native architectures.</w:t>
+        <w:t xml:space="preserve">Core impact areas include: centralized chemistry &amp; reaction processing, parent/child registration lineage, advanced searching, SAML SSO enablement, bulk import reliability (chem + bio sequences), internationalization &amp; data privacy hardening, and CI/CD pipeline standardization (Azure DevOps + Kubernetes). Recognized as a trusted technical partner who accelerates delivery while elevating quality, observability, and maintainability.</w:t>
+      </w:r>
+    </w:p>
+    <w:p>
+      <w:pPr>
+        <w:ind w:left="720" w:firstLine="0"/>
+        <w:rPr>
+          <w:rFonts w:ascii="Calibri" w:cs="Calibri" w:eastAsia="Calibri" w:hAnsi="Calibri"/>
+          <w:sz w:val="24"/>
+          <w:szCs w:val="24"/>
+        </w:rPr>
+      </w:pPr>
+      <w:r>
+        <w:rPr>
+          <w:rtl w:val="0"/>
+        </w:rPr>
+      </w:r>
+    </w:p>
+    <w:p>
+      <w:pPr>
+        <w:rPr>
+          <w:rFonts w:ascii="Calibri" w:cs="Calibri" w:eastAsia="Calibri" w:hAnsi="Calibri"/>
+          <w:sz w:val="24"/>
+          <w:szCs w:val="24"/>
+        </w:rPr>
+      </w:pPr>
+      <w:r>
+        <w:rPr>
+          <w:rFonts w:ascii="Cambria" w:cs="Cambria" w:eastAsia="Cambria" w:hAnsi="Cambria"/>
+          <w:b w:val="1"/>
+          <w:rtl w:val="0"/>
+        </w:rPr>
+        <w:t xml:space="preserve">STRENGTHS:</w:t>
+      </w:r>
+      <w:r>
+        <w:rPr>
+          <w:rtl w:val="0"/>
+        </w:rPr>
+      </w:r>
+    </w:p>
+    <w:p>
+      <w:pPr>
+        <w:ind w:left="720" w:firstLine="0"/>
+        <w:rPr>
+          <w:rFonts w:ascii="Calibri" w:cs="Calibri" w:eastAsia="Calibri" w:hAnsi="Calibri"/>
+          <w:sz w:val="24"/>
+          <w:szCs w:val="24"/>
+        </w:rPr>
+      </w:pPr>
+      <w:r>
+        <w:rPr>
+          <w:rFonts w:ascii="Calibri" w:cs="Calibri" w:eastAsia="Calibri" w:hAnsi="Calibri"/>
+          <w:sz w:val="24"/>
+          <w:szCs w:val="24"/>
+          <w:rtl w:val="0"/>
+        </w:rPr>
+        <w:t xml:space="preserve">Full-Stack Web Engineering ▪ Systems &amp; Data Architecture ▪ Application Modernization ▪ API &amp; Integration Patterns ▪ Performance &amp; Scalability ▪ Identity &amp; Security (SAML SSO) ▪ DevOps &amp; CI/CD Automation ▪ Kubernetes Deployments ▪ Legacy Remediation ▪ Observability &amp; Diagnostics ▪ Cross-Functional Collaboration ▪ Technical Mentorship ▪ Process Improvement ▪ Quality Engineering</w:t>
       </w:r>
     </w:p>
     <w:p>
@@ -222,7 +257,7 @@
           <w:b w:val="1"/>
           <w:rtl w:val="0"/>
         </w:rPr>
-        <w:t xml:space="preserve">EMPLOYMENT:</w:t>
+        <w:t xml:space="preserve">PROFESSIONAL EXPERIENCE:</w:t>
       </w:r>
     </w:p>
     <w:p>
@@ -296,36 +331,7 @@
       <w:pPr>
         <w:numPr>
           <w:ilvl w:val="0"/>
-          <w:numId w:val="7"/>
-        </w:numPr>
-        <w:tabs>
-          <w:tab w:val="center" w:leader="none" w:pos="90"/>
-          <w:tab w:val="left" w:leader="none" w:pos="-4860"/>
-          <w:tab w:val="left" w:leader="none" w:pos="450"/>
-        </w:tabs>
-        <w:ind w:left="720" w:right="-360" w:hanging="360"/>
-        <w:rPr>
-          <w:rFonts w:ascii="Calibri" w:cs="Calibri" w:eastAsia="Calibri" w:hAnsi="Calibri"/>
-          <w:sz w:val="24"/>
-          <w:szCs w:val="24"/>
-          <w:u w:val="none"/>
-        </w:rPr>
-      </w:pPr>
-      <w:r>
-        <w:rPr>
-          <w:rFonts w:ascii="Calibri" w:cs="Calibri" w:eastAsia="Calibri" w:hAnsi="Calibri"/>
-          <w:sz w:val="24"/>
-          <w:szCs w:val="24"/>
-          <w:rtl w:val="0"/>
-        </w:rPr>
-        <w:t xml:space="preserve">Design and code new applications and components as leading role in a small team using C#, React, and SQL and related technologies.</w:t>
-      </w:r>
-    </w:p>
-    <w:p>
-      <w:pPr>
-        <w:numPr>
-          <w:ilvl w:val="0"/>
-          <w:numId w:val="7"/>
+          <w:numId w:val="6"/>
         </w:numPr>
         <w:tabs>
           <w:tab w:val="center" w:leader="none" w:pos="90"/>
@@ -347,14 +353,14 @@
           <w:szCs w:val="24"/>
           <w:rtl w:val="0"/>
         </w:rPr>
-        <w:t xml:space="preserve">Maintain and modify existing applications written in Classic ASP, JavaScript, Python, and PHP.</w:t>
-      </w:r>
-    </w:p>
-    <w:p>
-      <w:pPr>
-        <w:numPr>
-          <w:ilvl w:val="0"/>
-          <w:numId w:val="7"/>
+        <w:t xml:space="preserve">Modernized multi-tenant ELN / registration platform: refactored core request &amp; configuration services for extensibility and performance.</w:t>
+      </w:r>
+    </w:p>
+    <w:p>
+      <w:pPr>
+        <w:numPr>
+          <w:ilvl w:val="0"/>
+          <w:numId w:val="6"/>
         </w:numPr>
         <w:tabs>
           <w:tab w:val="center" w:leader="none" w:pos="90"/>
@@ -376,14 +382,14 @@
           <w:szCs w:val="24"/>
           <w:rtl w:val="0"/>
         </w:rPr>
-        <w:t xml:space="preserve">Leading internal projects including SAML SSO integration, automated testing, bulk record processing,  3rd party API integrations, and many other smaller projects.</w:t>
-      </w:r>
-    </w:p>
-    <w:p>
-      <w:pPr>
-        <w:numPr>
-          <w:ilvl w:val="0"/>
-          <w:numId w:val="7"/>
+        <w:t xml:space="preserve">Centralized chemistry processing: CDXML conversions, salt &amp; stereochemistry normalization, stoichiometry &amp; reaction APIs.</w:t>
+      </w:r>
+    </w:p>
+    <w:p>
+      <w:pPr>
+        <w:numPr>
+          <w:ilvl w:val="0"/>
+          <w:numId w:val="6"/>
         </w:numPr>
         <w:tabs>
           <w:tab w:val="center" w:leader="none" w:pos="90"/>
@@ -405,14 +411,14 @@
           <w:szCs w:val="24"/>
           <w:rtl w:val="0"/>
         </w:rPr>
-        <w:t xml:space="preserve">Configure and run deployments in Kubernetes, manage and develop CI/CD in Azure DevOps.</w:t>
-      </w:r>
-    </w:p>
-    <w:p>
-      <w:pPr>
-        <w:numPr>
-          <w:ilvl w:val="0"/>
-          <w:numId w:val="7"/>
+        <w:t xml:space="preserve">Expanded registration workflows: parent/child lineage, gap-free numbering, stoichiometry grid, salts &amp; structure property derivation, sequence validation.</w:t>
+      </w:r>
+    </w:p>
+    <w:p>
+      <w:pPr>
+        <w:numPr>
+          <w:ilvl w:val="0"/>
+          <w:numId w:val="6"/>
         </w:numPr>
         <w:tabs>
           <w:tab w:val="center" w:leader="none" w:pos="90"/>
@@ -434,7 +440,297 @@
           <w:szCs w:val="24"/>
           <w:rtl w:val="0"/>
         </w:rPr>
-        <w:t xml:space="preserve">Collaborate cross-functionally with other engineers, project managers, business users, and customers to achieve elegant solutions.</w:t>
+        <w:t xml:space="preserve">Engineered resilient bulk import &amp; update pipelines (chem + bio sequences, SDF/SD, sub-data mapping, warning/error framework).</w:t>
+      </w:r>
+    </w:p>
+    <w:p>
+      <w:pPr>
+        <w:numPr>
+          <w:ilvl w:val="0"/>
+          <w:numId w:val="6"/>
+        </w:numPr>
+        <w:tabs>
+          <w:tab w:val="center" w:leader="none" w:pos="90"/>
+          <w:tab w:val="left" w:leader="none" w:pos="-4860"/>
+          <w:tab w:val="left" w:leader="none" w:pos="360"/>
+        </w:tabs>
+        <w:ind w:left="720" w:right="-360" w:hanging="360"/>
+        <w:rPr>
+          <w:rFonts w:ascii="Calibri" w:cs="Calibri" w:eastAsia="Calibri" w:hAnsi="Calibri"/>
+          <w:sz w:val="24"/>
+          <w:szCs w:val="24"/>
+          <w:u w:val="none"/>
+        </w:rPr>
+      </w:pPr>
+      <w:r>
+        <w:rPr>
+          <w:rFonts w:ascii="Calibri" w:cs="Calibri" w:eastAsia="Calibri" w:hAnsi="Calibri"/>
+          <w:sz w:val="24"/>
+          <w:szCs w:val="24"/>
+          <w:rtl w:val="0"/>
+        </w:rPr>
+        <w:t xml:space="preserve">Led SAML SSO &amp; identity integration (enterprise metadata, multi-environment configs) streamlining customer onboarding.</w:t>
+      </w:r>
+    </w:p>
+    <w:p>
+      <w:pPr>
+        <w:numPr>
+          <w:ilvl w:val="0"/>
+          <w:numId w:val="6"/>
+        </w:numPr>
+        <w:tabs>
+          <w:tab w:val="center" w:leader="none" w:pos="90"/>
+          <w:tab w:val="left" w:leader="none" w:pos="-4860"/>
+          <w:tab w:val="left" w:leader="none" w:pos="360"/>
+        </w:tabs>
+        <w:ind w:left="720" w:right="-360" w:hanging="360"/>
+        <w:rPr>
+          <w:rFonts w:ascii="Calibri" w:cs="Calibri" w:eastAsia="Calibri" w:hAnsi="Calibri"/>
+          <w:sz w:val="24"/>
+          <w:szCs w:val="24"/>
+          <w:u w:val="none"/>
+        </w:rPr>
+      </w:pPr>
+      <w:r>
+        <w:rPr>
+          <w:rFonts w:ascii="Calibri" w:cs="Calibri" w:eastAsia="Calibri" w:hAnsi="Calibri"/>
+          <w:sz w:val="24"/>
+          <w:szCs w:val="24"/>
+          <w:rtl w:val="0"/>
+        </w:rPr>
+        <w:t xml:space="preserve">Built comprehensive Postman API test suite (multi-environment matrices + pipeline integration) raising regression confidence.</w:t>
+      </w:r>
+    </w:p>
+    <w:p>
+      <w:pPr>
+        <w:numPr>
+          <w:ilvl w:val="0"/>
+          <w:numId w:val="6"/>
+        </w:numPr>
+        <w:tabs>
+          <w:tab w:val="center" w:leader="none" w:pos="90"/>
+          <w:tab w:val="left" w:leader="none" w:pos="-4860"/>
+          <w:tab w:val="left" w:leader="none" w:pos="360"/>
+        </w:tabs>
+        <w:ind w:left="720" w:right="-360" w:hanging="360"/>
+        <w:rPr>
+          <w:rFonts w:ascii="Calibri" w:cs="Calibri" w:eastAsia="Calibri" w:hAnsi="Calibri"/>
+          <w:sz w:val="24"/>
+          <w:szCs w:val="24"/>
+          <w:u w:val="none"/>
+        </w:rPr>
+      </w:pPr>
+      <w:r>
+        <w:rPr>
+          <w:rFonts w:ascii="Calibri" w:cs="Calibri" w:eastAsia="Calibri" w:hAnsi="Calibri"/>
+          <w:sz w:val="24"/>
+          <w:szCs w:val="24"/>
+          <w:rtl w:val="0"/>
+        </w:rPr>
+        <w:t xml:space="preserve">Strengthened unit &amp; integration test coverage; upgraded MSTest frameworks and introduced coverage tooling.</w:t>
+      </w:r>
+    </w:p>
+    <w:p>
+      <w:pPr>
+        <w:numPr>
+          <w:ilvl w:val="0"/>
+          <w:numId w:val="6"/>
+        </w:numPr>
+        <w:tabs>
+          <w:tab w:val="center" w:leader="none" w:pos="90"/>
+          <w:tab w:val="left" w:leader="none" w:pos="-4860"/>
+          <w:tab w:val="left" w:leader="none" w:pos="360"/>
+        </w:tabs>
+        <w:ind w:left="720" w:right="-360" w:hanging="360"/>
+        <w:rPr>
+          <w:rFonts w:ascii="Calibri" w:cs="Calibri" w:eastAsia="Calibri" w:hAnsi="Calibri"/>
+          <w:sz w:val="24"/>
+          <w:szCs w:val="24"/>
+          <w:u w:val="none"/>
+        </w:rPr>
+      </w:pPr>
+      <w:r>
+        <w:rPr>
+          <w:rFonts w:ascii="Calibri" w:cs="Calibri" w:eastAsia="Calibri" w:hAnsi="Calibri"/>
+          <w:sz w:val="24"/>
+          <w:szCs w:val="24"/>
+          <w:rtl w:val="0"/>
+        </w:rPr>
+        <w:t xml:space="preserve">Implemented feature flag strategy (stoichiometry, inventory linking, chemistry canvas, CAS / CRAIS checks) enabling incremental rollout.</w:t>
+      </w:r>
+    </w:p>
+    <w:p>
+      <w:pPr>
+        <w:numPr>
+          <w:ilvl w:val="0"/>
+          <w:numId w:val="6"/>
+        </w:numPr>
+        <w:tabs>
+          <w:tab w:val="center" w:leader="none" w:pos="90"/>
+          <w:tab w:val="left" w:leader="none" w:pos="-4860"/>
+          <w:tab w:val="left" w:leader="none" w:pos="360"/>
+        </w:tabs>
+        <w:ind w:left="720" w:right="-360" w:hanging="360"/>
+        <w:rPr>
+          <w:rFonts w:ascii="Calibri" w:cs="Calibri" w:eastAsia="Calibri" w:hAnsi="Calibri"/>
+          <w:sz w:val="24"/>
+          <w:szCs w:val="24"/>
+          <w:u w:val="none"/>
+        </w:rPr>
+      </w:pPr>
+      <w:r>
+        <w:rPr>
+          <w:rFonts w:ascii="Calibri" w:cs="Calibri" w:eastAsia="Calibri" w:hAnsi="Calibri"/>
+          <w:sz w:val="24"/>
+          <w:szCs w:val="24"/>
+          <w:rtl w:val="0"/>
+        </w:rPr>
+        <w:t xml:space="preserve">Introduced structured logging, performance instrumentation &amp; interface log service improving diagnostics &amp; mean time to recovery.</w:t>
+      </w:r>
+    </w:p>
+    <w:p>
+      <w:pPr>
+        <w:numPr>
+          <w:ilvl w:val="0"/>
+          <w:numId w:val="6"/>
+        </w:numPr>
+        <w:tabs>
+          <w:tab w:val="center" w:leader="none" w:pos="90"/>
+          <w:tab w:val="left" w:leader="none" w:pos="-4860"/>
+          <w:tab w:val="left" w:leader="none" w:pos="360"/>
+        </w:tabs>
+        <w:ind w:left="720" w:right="-360" w:hanging="360"/>
+        <w:rPr>
+          <w:rFonts w:ascii="Calibri" w:cs="Calibri" w:eastAsia="Calibri" w:hAnsi="Calibri"/>
+          <w:sz w:val="24"/>
+          <w:szCs w:val="24"/>
+          <w:u w:val="none"/>
+        </w:rPr>
+      </w:pPr>
+      <w:r>
+        <w:rPr>
+          <w:rFonts w:ascii="Calibri" w:cs="Calibri" w:eastAsia="Calibri" w:hAnsi="Calibri"/>
+          <w:sz w:val="24"/>
+          <w:szCs w:val="24"/>
+          <w:rtl w:val="0"/>
+        </w:rPr>
+        <w:t xml:space="preserve">Drove Azure DevOps + Kubernetes delivery improvements: templated pipelines, repeatable promotion, deployment reliability.</w:t>
+      </w:r>
+    </w:p>
+    <w:p>
+      <w:pPr>
+        <w:numPr>
+          <w:ilvl w:val="0"/>
+          <w:numId w:val="6"/>
+        </w:numPr>
+        <w:tabs>
+          <w:tab w:val="center" w:leader="none" w:pos="90"/>
+          <w:tab w:val="left" w:leader="none" w:pos="-4860"/>
+          <w:tab w:val="left" w:leader="none" w:pos="360"/>
+        </w:tabs>
+        <w:ind w:left="720" w:right="-360" w:hanging="360"/>
+        <w:rPr>
+          <w:rFonts w:ascii="Calibri" w:cs="Calibri" w:eastAsia="Calibri" w:hAnsi="Calibri"/>
+          <w:sz w:val="24"/>
+          <w:szCs w:val="24"/>
+          <w:u w:val="none"/>
+        </w:rPr>
+      </w:pPr>
+      <w:r>
+        <w:rPr>
+          <w:rFonts w:ascii="Calibri" w:cs="Calibri" w:eastAsia="Calibri" w:hAnsi="Calibri"/>
+          <w:sz w:val="24"/>
+          <w:szCs w:val="24"/>
+          <w:rtl w:val="0"/>
+        </w:rPr>
+        <w:t xml:space="preserve">Reduced technical debt across legacy Classic ASP / PHP / Python surfaces; migrated critical chem &amp; search logic to services.</w:t>
+      </w:r>
+    </w:p>
+    <w:p>
+      <w:pPr>
+        <w:numPr>
+          <w:ilvl w:val="0"/>
+          <w:numId w:val="6"/>
+        </w:numPr>
+        <w:tabs>
+          <w:tab w:val="center" w:leader="none" w:pos="90"/>
+          <w:tab w:val="left" w:leader="none" w:pos="-4860"/>
+          <w:tab w:val="left" w:leader="none" w:pos="360"/>
+        </w:tabs>
+        <w:ind w:left="720" w:right="-360" w:hanging="360"/>
+        <w:rPr>
+          <w:rFonts w:ascii="Calibri" w:cs="Calibri" w:eastAsia="Calibri" w:hAnsi="Calibri"/>
+          <w:sz w:val="24"/>
+          <w:szCs w:val="24"/>
+          <w:u w:val="none"/>
+        </w:rPr>
+      </w:pPr>
+      <w:r>
+        <w:rPr>
+          <w:rFonts w:ascii="Calibri" w:cs="Calibri" w:eastAsia="Calibri" w:hAnsi="Calibri"/>
+          <w:sz w:val="24"/>
+          <w:szCs w:val="24"/>
+          <w:rtl w:val="0"/>
+        </w:rPr>
+        <w:t xml:space="preserve">Advanced internationalization (new locales, culture defaults) and data privacy (PII minimization).</w:t>
+      </w:r>
+    </w:p>
+    <w:p>
+      <w:pPr>
+        <w:numPr>
+          <w:ilvl w:val="0"/>
+          <w:numId w:val="6"/>
+        </w:numPr>
+        <w:tabs>
+          <w:tab w:val="center" w:leader="none" w:pos="90"/>
+          <w:tab w:val="left" w:leader="none" w:pos="-4860"/>
+          <w:tab w:val="left" w:leader="none" w:pos="360"/>
+        </w:tabs>
+        <w:ind w:left="720" w:right="-360" w:hanging="360"/>
+        <w:rPr>
+          <w:rFonts w:ascii="Calibri" w:cs="Calibri" w:eastAsia="Calibri" w:hAnsi="Calibri"/>
+          <w:sz w:val="24"/>
+          <w:szCs w:val="24"/>
+          <w:u w:val="none"/>
+        </w:rPr>
+      </w:pPr>
+      <w:r>
+        <w:rPr>
+          <w:rFonts w:ascii="Calibri" w:cs="Calibri" w:eastAsia="Calibri" w:hAnsi="Calibri"/>
+          <w:sz w:val="24"/>
+          <w:szCs w:val="24"/>
+          <w:rtl w:val="0"/>
+        </w:rPr>
+        <w:t xml:space="preserve">Refined permission &amp; role gating (restricted search, inventory linking visibility) enhancing security posture.</w:t>
+      </w:r>
+    </w:p>
+    <w:p>
+      <w:pPr>
+        <w:numPr>
+          <w:ilvl w:val="0"/>
+          <w:numId w:val="6"/>
+        </w:numPr>
+        <w:tabs>
+          <w:tab w:val="center" w:leader="none" w:pos="90"/>
+          <w:tab w:val="left" w:leader="none" w:pos="-4860"/>
+          <w:tab w:val="left" w:leader="none" w:pos="360"/>
+        </w:tabs>
+        <w:ind w:left="720" w:right="-360" w:hanging="360"/>
+        <w:rPr>
+          <w:rFonts w:ascii="Calibri" w:cs="Calibri" w:eastAsia="Calibri" w:hAnsi="Calibri"/>
+          <w:sz w:val="24"/>
+          <w:szCs w:val="24"/>
+          <w:u w:val="none"/>
+        </w:rPr>
+      </w:pPr>
+      <w:r>
+        <w:rPr>
+          <w:rFonts w:ascii="Calibri" w:cs="Calibri" w:eastAsia="Calibri" w:hAnsi="Calibri"/>
+          <w:sz w:val="24"/>
+          <w:szCs w:val="24"/>
+          <w:rtl w:val="0"/>
+        </w:rPr>
+        <w:t xml:space="preserve">Mentored engineers in code review, observability patterns, and sustainable refactoring practices.</w:t>
       </w:r>
     </w:p>
     <w:p>
@@ -522,7 +818,7 @@
       <w:pPr>
         <w:numPr>
           <w:ilvl w:val="0"/>
-          <w:numId w:val="5"/>
+          <w:numId w:val="4"/>
         </w:numPr>
         <w:tabs>
           <w:tab w:val="left" w:leader="none" w:pos="-4860"/>
@@ -543,14 +839,14 @@
           <w:szCs w:val="24"/>
           <w:rtl w:val="0"/>
         </w:rPr>
-        <w:t xml:space="preserve">Delivered enterprise RESTful web applications on Java EE with Spring and Hibernate; designed clear APIs and modular components.</w:t>
-      </w:r>
-    </w:p>
-    <w:p>
-      <w:pPr>
-        <w:numPr>
-          <w:ilvl w:val="0"/>
-          <w:numId w:val="5"/>
+        <w:t xml:space="preserve">Engineered Java EE / Spring / Hibernate services &amp; UI components powering core insurance workflows.</w:t>
+      </w:r>
+    </w:p>
+    <w:p>
+      <w:pPr>
+        <w:numPr>
+          <w:ilvl w:val="0"/>
+          <w:numId w:val="4"/>
         </w:numPr>
         <w:tabs>
           <w:tab w:val="left" w:leader="none" w:pos="-4860"/>
@@ -571,14 +867,14 @@
           <w:szCs w:val="24"/>
           <w:rtl w:val="0"/>
         </w:rPr>
-        <w:t xml:space="preserve">Helped lead the organization's transition to Git by defining branching and pull-request workflows, enabling code reviews, and improving release discipline.</w:t>
-      </w:r>
-    </w:p>
-    <w:p>
-      <w:pPr>
-        <w:numPr>
-          <w:ilvl w:val="0"/>
-          <w:numId w:val="5"/>
+        <w:t xml:space="preserve">Co-led git adoption: branching strategy, review discipline; improved release stability.</w:t>
+      </w:r>
+    </w:p>
+    <w:p>
+      <w:pPr>
+        <w:numPr>
+          <w:ilvl w:val="0"/>
+          <w:numId w:val="4"/>
         </w:numPr>
         <w:tabs>
           <w:tab w:val="left" w:leader="none" w:pos="-4860"/>
@@ -599,14 +895,14 @@
           <w:szCs w:val="24"/>
           <w:rtl w:val="0"/>
         </w:rPr>
-        <w:t xml:space="preserve">Improved performance and reliability by profiling hotspots, optimizing Hibernate/SQL access patterns, and strengthening logging and monitoring.</w:t>
-      </w:r>
-    </w:p>
-    <w:p>
-      <w:pPr>
-        <w:numPr>
-          <w:ilvl w:val="0"/>
-          <w:numId w:val="5"/>
+        <w:t xml:space="preserve">Optimized ORM &amp; SQL hotspots elevating responsiveness &amp; reliability under load.</w:t>
+      </w:r>
+    </w:p>
+    <w:p>
+      <w:pPr>
+        <w:numPr>
+          <w:ilvl w:val="0"/>
+          <w:numId w:val="4"/>
         </w:numPr>
         <w:tabs>
           <w:tab w:val="left" w:leader="none" w:pos="-4860"/>
@@ -627,14 +923,14 @@
           <w:szCs w:val="24"/>
           <w:rtl w:val="0"/>
         </w:rPr>
-        <w:t xml:space="preserve">Contributed to Maven-based build automation to increase consistency and predictability of releases.</w:t>
-      </w:r>
-    </w:p>
-    <w:p>
-      <w:pPr>
-        <w:numPr>
-          <w:ilvl w:val="0"/>
-          <w:numId w:val="5"/>
+        <w:t xml:space="preserve">Introduced structured logging &amp; diagnostics accelerating root cause analysis.</w:t>
+      </w:r>
+    </w:p>
+    <w:p>
+      <w:pPr>
+        <w:numPr>
+          <w:ilvl w:val="0"/>
+          <w:numId w:val="4"/>
         </w:numPr>
         <w:tabs>
           <w:tab w:val="left" w:leader="none" w:pos="-4860"/>
@@ -655,7 +951,35 @@
           <w:szCs w:val="24"/>
           <w:rtl w:val="0"/>
         </w:rPr>
-        <w:t xml:space="preserve">Mentored teammates and championed engineering standards, code quality, and best practices.</w:t>
+        <w:t xml:space="preserve">Extended Maven automation &amp; dependency management, standardizing delivery.</w:t>
+      </w:r>
+    </w:p>
+    <w:p>
+      <w:pPr>
+        <w:numPr>
+          <w:ilvl w:val="0"/>
+          <w:numId w:val="4"/>
+        </w:numPr>
+        <w:tabs>
+          <w:tab w:val="left" w:leader="none" w:pos="-4860"/>
+          <w:tab w:val="left" w:leader="none" w:pos="360"/>
+        </w:tabs>
+        <w:ind w:left="720" w:right="-360" w:hanging="360"/>
+        <w:rPr>
+          <w:rFonts w:ascii="Calibri" w:cs="Calibri" w:eastAsia="Calibri" w:hAnsi="Calibri"/>
+          <w:sz w:val="24"/>
+          <w:szCs w:val="24"/>
+          <w:u w:val="none"/>
+        </w:rPr>
+      </w:pPr>
+      <w:r>
+        <w:rPr>
+          <w:rFonts w:ascii="Calibri" w:cs="Calibri" w:eastAsia="Calibri" w:hAnsi="Calibri"/>
+          <w:sz w:val="24"/>
+          <w:szCs w:val="24"/>
+          <w:rtl w:val="0"/>
+        </w:rPr>
+        <w:t xml:space="preserve">Mentored peers on refactoring strategy &amp; maintainable design principles.</w:t>
       </w:r>
       <w:r>
         <w:rPr>
@@ -763,10 +1087,11 @@
         </w:pBdr>
         <w:shd w:fill="auto" w:val="clear"/>
         <w:tabs>
+          <w:tab w:val="center" w:leader="none" w:pos="-4770"/>
           <w:tab w:val="left" w:leader="none" w:pos="360"/>
         </w:tabs>
-        <w:spacing w:after="0" w:before="120" w:line="240" w:lineRule="auto"/>
-        <w:ind w:left="720" w:right="0" w:hanging="360"/>
+        <w:spacing w:after="0" w:before="0" w:line="240" w:lineRule="auto"/>
+        <w:ind w:left="720" w:right="-360" w:hanging="360"/>
         <w:jc w:val="left"/>
         <w:rPr>
           <w:rFonts w:ascii="Calibri" w:cs="Calibri" w:eastAsia="Calibri" w:hAnsi="Calibri"/>
@@ -785,19 +1110,11 @@
       <w:r>
         <w:rPr>
           <w:rFonts w:ascii="Calibri" w:cs="Calibri" w:eastAsia="Calibri" w:hAnsi="Calibri"/>
-          <w:b w:val="0"/>
-          <w:i w:val="0"/>
-          <w:smallCaps w:val="0"/>
-          <w:strike w:val="0"/>
-          <w:color w:val="000000"/>
-          <w:sz w:val="24"/>
-          <w:szCs w:val="24"/>
-          <w:u w:val="none"/>
-          <w:shd w:fill="auto" w:val="clear"/>
-          <w:vertAlign w:val="baseline"/>
-          <w:rtl w:val="0"/>
-        </w:rPr>
-        <w:t xml:space="preserve">Developed applications to manage internal workflows as leader of a two person team using Spring MVC, Hibernate, JUnit, JSP, Bootstrap, JQuery and HTML5.</w:t>
+          <w:sz w:val="24"/>
+          <w:szCs w:val="24"/>
+          <w:rtl w:val="0"/>
+        </w:rPr>
+        <w:t xml:space="preserve">Built internal workflow &amp; content tools (Spring MVC, Hibernate, JSP, Bootstrap, jQuery) reducing manual editorial effort.</w:t>
       </w:r>
     </w:p>
     <w:p>
@@ -819,10 +1136,11 @@
         </w:pBdr>
         <w:shd w:fill="auto" w:val="clear"/>
         <w:tabs>
+          <w:tab w:val="center" w:leader="none" w:pos="-4770"/>
           <w:tab w:val="left" w:leader="none" w:pos="360"/>
         </w:tabs>
         <w:spacing w:after="0" w:before="0" w:line="240" w:lineRule="auto"/>
-        <w:ind w:left="720" w:right="0" w:hanging="360"/>
+        <w:ind w:left="720" w:right="-360" w:hanging="360"/>
         <w:jc w:val="left"/>
         <w:rPr>
           <w:rFonts w:ascii="Calibri" w:cs="Calibri" w:eastAsia="Calibri" w:hAnsi="Calibri"/>
@@ -841,19 +1159,11 @@
       <w:r>
         <w:rPr>
           <w:rFonts w:ascii="Calibri" w:cs="Calibri" w:eastAsia="Calibri" w:hAnsi="Calibri"/>
-          <w:b w:val="0"/>
-          <w:i w:val="0"/>
-          <w:smallCaps w:val="0"/>
-          <w:strike w:val="0"/>
-          <w:color w:val="000000"/>
-          <w:sz w:val="24"/>
-          <w:szCs w:val="24"/>
-          <w:u w:val="none"/>
-          <w:shd w:fill="auto" w:val="clear"/>
-          <w:vertAlign w:val="baseline"/>
-          <w:rtl w:val="0"/>
-        </w:rPr>
-        <w:t xml:space="preserve">Developed web application to facilitate outside content review using PHP, MySQL, and JavaScript. </w:t>
+          <w:sz w:val="24"/>
+          <w:szCs w:val="24"/>
+          <w:rtl w:val="0"/>
+        </w:rPr>
+        <w:t xml:space="preserve">Developed secure external content review portal (PHP, MySQL, JavaScript) enabling partner collaboration.</w:t>
       </w:r>
     </w:p>
     <w:p>
@@ -875,10 +1185,11 @@
         </w:pBdr>
         <w:shd w:fill="auto" w:val="clear"/>
         <w:tabs>
+          <w:tab w:val="center" w:leader="none" w:pos="-4770"/>
           <w:tab w:val="left" w:leader="none" w:pos="360"/>
         </w:tabs>
         <w:spacing w:after="0" w:before="0" w:line="240" w:lineRule="auto"/>
-        <w:ind w:left="720" w:right="0" w:hanging="360"/>
+        <w:ind w:left="720" w:right="-360" w:hanging="360"/>
         <w:jc w:val="left"/>
         <w:rPr>
           <w:rFonts w:ascii="Calibri" w:cs="Calibri" w:eastAsia="Calibri" w:hAnsi="Calibri"/>
@@ -897,19 +1208,11 @@
       <w:r>
         <w:rPr>
           <w:rFonts w:ascii="Calibri" w:cs="Calibri" w:eastAsia="Calibri" w:hAnsi="Calibri"/>
-          <w:b w:val="0"/>
-          <w:i w:val="0"/>
-          <w:smallCaps w:val="0"/>
-          <w:strike w:val="0"/>
-          <w:color w:val="000000"/>
-          <w:sz w:val="24"/>
-          <w:szCs w:val="24"/>
-          <w:u w:val="none"/>
-          <w:shd w:fill="auto" w:val="clear"/>
-          <w:vertAlign w:val="baseline"/>
-          <w:rtl w:val="0"/>
-        </w:rPr>
-        <w:t xml:space="preserve">Wrote many smaller applications, software extensions, maintained legacy applications, managed application servers and wrote reports using appropriate technologies. </w:t>
+          <w:sz w:val="24"/>
+          <w:szCs w:val="24"/>
+          <w:rtl w:val="0"/>
+        </w:rPr>
+        <w:t xml:space="preserve">Created ingestion / transformation utilities (XML, JSON, CSV) improving metadata consistency &amp; search relevance.</w:t>
       </w:r>
     </w:p>
     <w:p>
@@ -954,113 +1257,11 @@
       <w:r>
         <w:rPr>
           <w:rFonts w:ascii="Calibri" w:cs="Calibri" w:eastAsia="Calibri" w:hAnsi="Calibri"/>
-          <w:b w:val="0"/>
-          <w:i w:val="0"/>
-          <w:smallCaps w:val="0"/>
-          <w:strike w:val="0"/>
-          <w:color w:val="000000"/>
-          <w:sz w:val="24"/>
-          <w:szCs w:val="24"/>
-          <w:u w:val="none"/>
-          <w:shd w:fill="auto" w:val="clear"/>
-          <w:vertAlign w:val="baseline"/>
-          <w:rtl w:val="0"/>
-        </w:rPr>
-        <w:t xml:space="preserve">Took the lead where discussions involve consensus.</w:t>
-      </w:r>
-    </w:p>
-    <w:p>
-      <w:pPr>
-        <w:tabs>
-          <w:tab w:val="center" w:leader="none" w:pos="-4770"/>
-        </w:tabs>
-        <w:ind w:left="180" w:right="-360" w:firstLine="0"/>
-        <w:rPr>
-          <w:rFonts w:ascii="Calibri" w:cs="Calibri" w:eastAsia="Calibri" w:hAnsi="Calibri"/>
-          <w:sz w:val="24"/>
-          <w:szCs w:val="24"/>
-        </w:rPr>
-      </w:pPr>
-      <w:r>
-        <w:rPr>
-          <w:rtl w:val="0"/>
-        </w:rPr>
-      </w:r>
-    </w:p>
-    <w:p>
-      <w:pPr>
-        <w:shd w:fill="eeece1" w:val="clear"/>
-        <w:tabs>
-          <w:tab w:val="center" w:leader="none" w:pos="-4770"/>
-        </w:tabs>
-        <w:ind w:left="180" w:right="-360" w:firstLine="0"/>
-        <w:jc w:val="center"/>
-        <w:rPr>
-          <w:rFonts w:ascii="Calibri" w:cs="Calibri" w:eastAsia="Calibri" w:hAnsi="Calibri"/>
-          <w:b w:val="1"/>
-          <w:sz w:val="24"/>
-          <w:szCs w:val="24"/>
-        </w:rPr>
-      </w:pPr>
-      <w:r>
-        <w:rPr>
-          <w:rFonts w:ascii="Calibri" w:cs="Calibri" w:eastAsia="Calibri" w:hAnsi="Calibri"/>
-          <w:b w:val="1"/>
-          <w:sz w:val="24"/>
-          <w:szCs w:val="24"/>
-          <w:rtl w:val="0"/>
-        </w:rPr>
-        <w:t xml:space="preserve">Software Developer</w:t>
-      </w:r>
-    </w:p>
-    <w:p>
-      <w:pPr>
-        <w:shd w:fill="eeece1" w:val="clear"/>
-        <w:tabs>
-          <w:tab w:val="center" w:leader="none" w:pos="-4770"/>
-        </w:tabs>
-        <w:ind w:left="180" w:right="-360" w:firstLine="0"/>
-        <w:jc w:val="center"/>
-        <w:rPr>
-          <w:rFonts w:ascii="Calibri" w:cs="Calibri" w:eastAsia="Calibri" w:hAnsi="Calibri"/>
-          <w:sz w:val="24"/>
-          <w:szCs w:val="24"/>
-        </w:rPr>
-      </w:pPr>
-      <w:r>
-        <w:rPr>
-          <w:rFonts w:ascii="Calibri" w:cs="Calibri" w:eastAsia="Calibri" w:hAnsi="Calibri"/>
-          <w:sz w:val="24"/>
-          <w:szCs w:val="24"/>
-          <w:rtl w:val="0"/>
-        </w:rPr>
-        <w:t xml:space="preserve">March 2006 to September 2008</w:t>
-      </w:r>
-    </w:p>
-    <w:p>
-      <w:pPr>
-        <w:shd w:fill="eeece1" w:val="clear"/>
-        <w:tabs>
-          <w:tab w:val="center" w:leader="none" w:pos="-4770"/>
-        </w:tabs>
-        <w:ind w:left="180" w:right="-360" w:firstLine="0"/>
-        <w:jc w:val="center"/>
-        <w:rPr>
-          <w:rFonts w:ascii="Calibri" w:cs="Calibri" w:eastAsia="Calibri" w:hAnsi="Calibri"/>
-          <w:b w:val="1"/>
-          <w:sz w:val="24"/>
-          <w:szCs w:val="24"/>
-        </w:rPr>
-      </w:pPr>
-      <w:r>
-        <w:rPr>
-          <w:rFonts w:ascii="Calibri" w:cs="Calibri" w:eastAsia="Calibri" w:hAnsi="Calibri"/>
-          <w:b w:val="1"/>
-          <w:sz w:val="24"/>
-          <w:szCs w:val="24"/>
-          <w:rtl w:val="0"/>
-        </w:rPr>
-        <w:t xml:space="preserve">Compex Integrated Systems, Worcester, Massachusetts</w:t>
+          <w:sz w:val="24"/>
+          <w:szCs w:val="24"/>
+          <w:rtl w:val="0"/>
+        </w:rPr>
+        <w:t xml:space="preserve">Implemented automated testing &amp; structured build practices cutting regressions.</w:t>
       </w:r>
     </w:p>
     <w:p>
@@ -1071,7 +1272,7 @@
         <w:widowControl w:val="1"/>
         <w:numPr>
           <w:ilvl w:val="0"/>
-          <w:numId w:val="6"/>
+          <w:numId w:val="3"/>
         </w:numPr>
         <w:pBdr>
           <w:top w:space="0" w:sz="0" w:val="nil"/>
@@ -1085,7 +1286,7 @@
           <w:tab w:val="center" w:leader="none" w:pos="-4770"/>
           <w:tab w:val="left" w:leader="none" w:pos="360"/>
         </w:tabs>
-        <w:spacing w:after="0" w:before="120" w:line="240" w:lineRule="auto"/>
+        <w:spacing w:after="0" w:before="0" w:line="240" w:lineRule="auto"/>
         <w:ind w:left="720" w:right="-360" w:hanging="360"/>
         <w:jc w:val="left"/>
         <w:rPr>
@@ -1105,19 +1306,11 @@
       <w:r>
         <w:rPr>
           <w:rFonts w:ascii="Calibri" w:cs="Calibri" w:eastAsia="Calibri" w:hAnsi="Calibri"/>
-          <w:b w:val="0"/>
-          <w:i w:val="0"/>
-          <w:smallCaps w:val="0"/>
-          <w:strike w:val="0"/>
-          <w:color w:val="000000"/>
-          <w:sz w:val="24"/>
-          <w:szCs w:val="24"/>
-          <w:u w:val="none"/>
-          <w:shd w:fill="auto" w:val="clear"/>
-          <w:vertAlign w:val="baseline"/>
-          <w:rtl w:val="0"/>
-        </w:rPr>
-        <w:t xml:space="preserve">Developed and tested database software for a manufacturing environment.</w:t>
+          <w:sz w:val="24"/>
+          <w:szCs w:val="24"/>
+          <w:rtl w:val="0"/>
+        </w:rPr>
+        <w:t xml:space="preserve">Administered / tuned application servers; introduced monitoring &amp; structured logging for faster resolution.</w:t>
       </w:r>
     </w:p>
     <w:p>
@@ -1128,7 +1321,7 @@
         <w:widowControl w:val="1"/>
         <w:numPr>
           <w:ilvl w:val="0"/>
-          <w:numId w:val="6"/>
+          <w:numId w:val="3"/>
         </w:numPr>
         <w:pBdr>
           <w:top w:space="0" w:sz="0" w:val="nil"/>
@@ -1162,20 +1355,34 @@
       <w:r>
         <w:rPr>
           <w:rFonts w:ascii="Calibri" w:cs="Calibri" w:eastAsia="Calibri" w:hAnsi="Calibri"/>
-          <w:b w:val="0"/>
-          <w:i w:val="0"/>
-          <w:smallCaps w:val="0"/>
-          <w:strike w:val="0"/>
-          <w:color w:val="000000"/>
-          <w:sz w:val="24"/>
-          <w:szCs w:val="24"/>
-          <w:u w:val="none"/>
-          <w:shd w:fill="auto" w:val="clear"/>
-          <w:vertAlign w:val="baseline"/>
-          <w:rtl w:val="0"/>
-        </w:rPr>
-        <w:t xml:space="preserve">Worked with clients to deliver custom software to their specifications.</w:t>
-        <w:br w:type="textWrapping"/>
+          <w:sz w:val="24"/>
+          <w:szCs w:val="24"/>
+          <w:rtl w:val="0"/>
+        </w:rPr>
+        <w:t xml:space="preserve">Acted as technical mentor promoting clean architecture &amp; sustainable refactoring.</w:t>
+      </w:r>
+      <w:r>
+        <w:rPr>
+          <w:rtl w:val="0"/>
+        </w:rPr>
+      </w:r>
+    </w:p>
+    <w:p>
+      <w:pPr>
+        <w:tabs>
+          <w:tab w:val="center" w:leader="none" w:pos="-4770"/>
+        </w:tabs>
+        <w:ind w:left="180" w:right="-360" w:firstLine="0"/>
+        <w:rPr>
+          <w:rFonts w:ascii="Calibri" w:cs="Calibri" w:eastAsia="Calibri" w:hAnsi="Calibri"/>
+          <w:sz w:val="24"/>
+          <w:szCs w:val="24"/>
+        </w:rPr>
+      </w:pPr>
+      <w:r>
+        <w:rPr>
+          <w:rtl w:val="0"/>
+        </w:rPr>
       </w:r>
     </w:p>
     <w:p>
@@ -1195,18 +1402,13 @@
       </w:pPr>
       <w:r>
         <w:rPr>
-          <w:rFonts w:ascii="Cambria" w:cs="Cambria" w:eastAsia="Cambria" w:hAnsi="Cambria"/>
-          <w:b w:val="1"/>
-          <w:sz w:val="24"/>
-          <w:szCs w:val="24"/>
-          <w:rtl w:val="0"/>
-        </w:rPr>
-        <w:t xml:space="preserve">Music Director / Technical Support</w:t>
-      </w:r>
-      <w:r>
-        <w:rPr>
-          <w:rtl w:val="0"/>
-        </w:rPr>
+          <w:rFonts w:ascii="Calibri" w:cs="Calibri" w:eastAsia="Calibri" w:hAnsi="Calibri"/>
+          <w:b w:val="1"/>
+          <w:sz w:val="24"/>
+          <w:szCs w:val="24"/>
+          <w:rtl w:val="0"/>
+        </w:rPr>
+        <w:t xml:space="preserve">Software Developer</w:t>
       </w:r>
     </w:p>
     <w:p>
@@ -1230,7 +1432,7 @@
           <w:szCs w:val="24"/>
           <w:rtl w:val="0"/>
         </w:rPr>
-        <w:t xml:space="preserve">July 2005 to May 2008</w:t>
+        <w:t xml:space="preserve">March 2006 to September 2008</w:t>
       </w:r>
     </w:p>
     <w:p>
@@ -1250,23 +1452,13 @@
       </w:pPr>
       <w:r>
         <w:rPr>
-          <w:rFonts w:ascii="Cambria" w:cs="Cambria" w:eastAsia="Cambria" w:hAnsi="Cambria"/>
-          <w:b w:val="1"/>
-          <w:sz w:val="24"/>
-          <w:szCs w:val="24"/>
-          <w:rtl w:val="0"/>
-        </w:rPr>
-        <w:t xml:space="preserve">WSCW Radio</w:t>
-      </w:r>
-      <w:r>
-        <w:rPr>
-          <w:rFonts w:ascii="Calibri" w:cs="Calibri" w:eastAsia="Calibri" w:hAnsi="Calibri"/>
-          <w:b w:val="1"/>
-          <w:sz w:val="24"/>
-          <w:szCs w:val="24"/>
-          <w:rtl w:val="0"/>
-        </w:rPr>
-        <w:t xml:space="preserve">, Worcester, Massachusetts</w:t>
+          <w:rFonts w:ascii="Calibri" w:cs="Calibri" w:eastAsia="Calibri" w:hAnsi="Calibri"/>
+          <w:b w:val="1"/>
+          <w:sz w:val="24"/>
+          <w:szCs w:val="24"/>
+          <w:rtl w:val="0"/>
+        </w:rPr>
+        <w:t xml:space="preserve">Compex Integrated Systems, Worcester, Massachusetts</w:t>
       </w:r>
     </w:p>
     <w:p>
@@ -1277,7 +1469,7 @@
         <w:widowControl w:val="1"/>
         <w:numPr>
           <w:ilvl w:val="0"/>
-          <w:numId w:val="4"/>
+          <w:numId w:val="5"/>
         </w:numPr>
         <w:pBdr>
           <w:top w:space="0" w:sz="0" w:val="nil"/>
@@ -1323,7 +1515,7 @@
           <w:vertAlign w:val="baseline"/>
           <w:rtl w:val="0"/>
         </w:rPr>
-        <w:t xml:space="preserve">Operated and helped manage the on campus radio station.</w:t>
+        <w:t xml:space="preserve">Developed and tested database software for a manufacturing environment.</w:t>
       </w:r>
     </w:p>
     <w:p>
@@ -1334,7 +1526,7 @@
         <w:widowControl w:val="1"/>
         <w:numPr>
           <w:ilvl w:val="0"/>
-          <w:numId w:val="4"/>
+          <w:numId w:val="5"/>
         </w:numPr>
         <w:pBdr>
           <w:top w:space="0" w:sz="0" w:val="nil"/>
@@ -1380,304 +1572,8 @@
           <w:vertAlign w:val="baseline"/>
           <w:rtl w:val="0"/>
         </w:rPr>
-        <w:t xml:space="preserve">Managed all station equipment and software, including all necessary repairs.</w:t>
-      </w:r>
-    </w:p>
-    <w:p>
-      <w:pPr>
-        <w:keepNext w:val="0"/>
-        <w:keepLines w:val="0"/>
-        <w:pageBreakBefore w:val="0"/>
-        <w:widowControl w:val="1"/>
-        <w:numPr>
-          <w:ilvl w:val="0"/>
-          <w:numId w:val="4"/>
-        </w:numPr>
-        <w:pBdr>
-          <w:top w:space="0" w:sz="0" w:val="nil"/>
-          <w:left w:space="0" w:sz="0" w:val="nil"/>
-          <w:bottom w:space="0" w:sz="0" w:val="nil"/>
-          <w:right w:space="0" w:sz="0" w:val="nil"/>
-          <w:between w:space="0" w:sz="0" w:val="nil"/>
-        </w:pBdr>
-        <w:shd w:fill="auto" w:val="clear"/>
-        <w:tabs>
-          <w:tab w:val="center" w:leader="none" w:pos="-4770"/>
-          <w:tab w:val="left" w:leader="none" w:pos="360"/>
-        </w:tabs>
-        <w:spacing w:after="0" w:before="0" w:line="240" w:lineRule="auto"/>
-        <w:ind w:left="720" w:right="-360" w:hanging="360"/>
-        <w:jc w:val="left"/>
-        <w:rPr>
-          <w:rFonts w:ascii="Calibri" w:cs="Calibri" w:eastAsia="Calibri" w:hAnsi="Calibri"/>
-          <w:b w:val="0"/>
-          <w:i w:val="0"/>
-          <w:smallCaps w:val="0"/>
-          <w:strike w:val="0"/>
-          <w:color w:val="000000"/>
-          <w:sz w:val="24"/>
-          <w:szCs w:val="24"/>
-          <w:u w:val="none"/>
-          <w:shd w:fill="auto" w:val="clear"/>
-          <w:vertAlign w:val="baseline"/>
-        </w:rPr>
-      </w:pPr>
-      <w:r>
-        <w:rPr>
-          <w:rFonts w:ascii="Calibri" w:cs="Calibri" w:eastAsia="Calibri" w:hAnsi="Calibri"/>
-          <w:b w:val="0"/>
-          <w:i w:val="0"/>
-          <w:smallCaps w:val="0"/>
-          <w:strike w:val="0"/>
-          <w:color w:val="000000"/>
-          <w:sz w:val="24"/>
-          <w:szCs w:val="24"/>
-          <w:u w:val="none"/>
-          <w:shd w:fill="auto" w:val="clear"/>
-          <w:vertAlign w:val="baseline"/>
-          <w:rtl w:val="0"/>
-        </w:rPr>
-        <w:t xml:space="preserve">Training student disk jockeys on equipment operation.</w:t>
-      </w:r>
-    </w:p>
-    <w:p>
-      <w:pPr>
-        <w:keepNext w:val="0"/>
-        <w:keepLines w:val="0"/>
-        <w:pageBreakBefore w:val="0"/>
-        <w:widowControl w:val="1"/>
-        <w:numPr>
-          <w:ilvl w:val="0"/>
-          <w:numId w:val="4"/>
-        </w:numPr>
-        <w:pBdr>
-          <w:top w:space="0" w:sz="0" w:val="nil"/>
-          <w:left w:space="0" w:sz="0" w:val="nil"/>
-          <w:bottom w:space="0" w:sz="0" w:val="nil"/>
-          <w:right w:space="0" w:sz="0" w:val="nil"/>
-          <w:between w:space="0" w:sz="0" w:val="nil"/>
-        </w:pBdr>
-        <w:shd w:fill="auto" w:val="clear"/>
-        <w:tabs>
-          <w:tab w:val="center" w:leader="none" w:pos="-4770"/>
-          <w:tab w:val="left" w:leader="none" w:pos="360"/>
-        </w:tabs>
-        <w:spacing w:after="0" w:before="0" w:line="240" w:lineRule="auto"/>
-        <w:ind w:left="720" w:right="-360" w:hanging="360"/>
-        <w:jc w:val="left"/>
-        <w:rPr>
-          <w:rFonts w:ascii="Calibri" w:cs="Calibri" w:eastAsia="Calibri" w:hAnsi="Calibri"/>
-          <w:b w:val="0"/>
-          <w:i w:val="0"/>
-          <w:smallCaps w:val="0"/>
-          <w:strike w:val="0"/>
-          <w:color w:val="000000"/>
-          <w:sz w:val="24"/>
-          <w:szCs w:val="24"/>
-          <w:u w:val="none"/>
-          <w:shd w:fill="auto" w:val="clear"/>
-          <w:vertAlign w:val="baseline"/>
-        </w:rPr>
-      </w:pPr>
-      <w:r>
-        <w:rPr>
-          <w:rFonts w:ascii="Calibri" w:cs="Calibri" w:eastAsia="Calibri" w:hAnsi="Calibri"/>
-          <w:b w:val="0"/>
-          <w:i w:val="0"/>
-          <w:smallCaps w:val="0"/>
-          <w:strike w:val="0"/>
-          <w:color w:val="000000"/>
-          <w:sz w:val="24"/>
-          <w:szCs w:val="24"/>
-          <w:u w:val="none"/>
-          <w:shd w:fill="auto" w:val="clear"/>
-          <w:vertAlign w:val="baseline"/>
-          <w:rtl w:val="0"/>
-        </w:rPr>
-        <w:t xml:space="preserve">Tracked albums with promotion companies and record labels.</w:t>
+        <w:t xml:space="preserve">Worked with clients to deliver custom software to their specifications.</w:t>
         <w:br w:type="textWrapping"/>
-      </w:r>
-    </w:p>
-    <w:p>
-      <w:pPr>
-        <w:shd w:fill="eeece1" w:val="clear"/>
-        <w:tabs>
-          <w:tab w:val="center" w:leader="none" w:pos="-4770"/>
-        </w:tabs>
-        <w:ind w:left="180" w:right="-360" w:firstLine="0"/>
-        <w:jc w:val="center"/>
-        <w:rPr>
-          <w:rFonts w:ascii="Calibri" w:cs="Calibri" w:eastAsia="Calibri" w:hAnsi="Calibri"/>
-          <w:sz w:val="24"/>
-          <w:szCs w:val="24"/>
-        </w:rPr>
-      </w:pPr>
-      <w:r>
-        <w:rPr>
-          <w:rFonts w:ascii="Calibri" w:cs="Calibri" w:eastAsia="Calibri" w:hAnsi="Calibri"/>
-          <w:b w:val="1"/>
-          <w:sz w:val="24"/>
-          <w:szCs w:val="24"/>
-          <w:rtl w:val="0"/>
-        </w:rPr>
-        <w:t xml:space="preserve">Automated Clearing House Coordinator</w:t>
-        <w:br w:type="textWrapping"/>
-      </w:r>
-      <w:r>
-        <w:rPr>
-          <w:rFonts w:ascii="Calibri" w:cs="Calibri" w:eastAsia="Calibri" w:hAnsi="Calibri"/>
-          <w:sz w:val="24"/>
-          <w:szCs w:val="24"/>
-          <w:rtl w:val="0"/>
-        </w:rPr>
-        <w:t xml:space="preserve">June 2006 to November 2008</w:t>
-      </w:r>
-    </w:p>
-    <w:p>
-      <w:pPr>
-        <w:shd w:fill="eeece1" w:val="clear"/>
-        <w:tabs>
-          <w:tab w:val="center" w:leader="none" w:pos="-4770"/>
-        </w:tabs>
-        <w:ind w:left="180" w:right="-360" w:firstLine="0"/>
-        <w:jc w:val="center"/>
-        <w:rPr>
-          <w:rFonts w:ascii="Calibri" w:cs="Calibri" w:eastAsia="Calibri" w:hAnsi="Calibri"/>
-          <w:b w:val="1"/>
-          <w:sz w:val="24"/>
-          <w:szCs w:val="24"/>
-        </w:rPr>
-      </w:pPr>
-      <w:r>
-        <w:rPr>
-          <w:rFonts w:ascii="Calibri" w:cs="Calibri" w:eastAsia="Calibri" w:hAnsi="Calibri"/>
-          <w:b w:val="1"/>
-          <w:sz w:val="24"/>
-          <w:szCs w:val="24"/>
-          <w:rtl w:val="0"/>
-        </w:rPr>
-        <w:tab/>
-        <w:t xml:space="preserve">Commerce Bank &amp; Trust, Worcester, Massachusetts</w:t>
-      </w:r>
-    </w:p>
-    <w:p>
-      <w:pPr>
-        <w:keepNext w:val="0"/>
-        <w:keepLines w:val="0"/>
-        <w:pageBreakBefore w:val="0"/>
-        <w:widowControl w:val="1"/>
-        <w:numPr>
-          <w:ilvl w:val="0"/>
-          <w:numId w:val="1"/>
-        </w:numPr>
-        <w:pBdr>
-          <w:top w:space="0" w:sz="0" w:val="nil"/>
-          <w:left w:space="0" w:sz="0" w:val="nil"/>
-          <w:bottom w:space="0" w:sz="0" w:val="nil"/>
-          <w:right w:space="0" w:sz="0" w:val="nil"/>
-          <w:between w:space="0" w:sz="0" w:val="nil"/>
-        </w:pBdr>
-        <w:shd w:fill="auto" w:val="clear"/>
-        <w:tabs>
-          <w:tab w:val="center" w:leader="none" w:pos="-4770"/>
-          <w:tab w:val="left" w:leader="none" w:pos="-2970"/>
-          <w:tab w:val="left" w:leader="none" w:pos="-2610"/>
-          <w:tab w:val="left" w:leader="none" w:pos="-270"/>
-          <w:tab w:val="left" w:leader="none" w:pos="360"/>
-        </w:tabs>
-        <w:spacing w:after="0" w:before="120" w:line="240" w:lineRule="auto"/>
-        <w:ind w:left="720" w:right="-360" w:hanging="360"/>
-        <w:jc w:val="left"/>
-        <w:rPr>
-          <w:rFonts w:ascii="Calibri" w:cs="Calibri" w:eastAsia="Calibri" w:hAnsi="Calibri"/>
-          <w:b w:val="0"/>
-          <w:i w:val="0"/>
-          <w:smallCaps w:val="0"/>
-          <w:strike w:val="0"/>
-          <w:color w:val="000000"/>
-          <w:sz w:val="24"/>
-          <w:szCs w:val="24"/>
-          <w:u w:val="none"/>
-          <w:shd w:fill="auto" w:val="clear"/>
-          <w:vertAlign w:val="baseline"/>
-        </w:rPr>
-      </w:pPr>
-      <w:r>
-        <w:rPr>
-          <w:rFonts w:ascii="Calibri" w:cs="Calibri" w:eastAsia="Calibri" w:hAnsi="Calibri"/>
-          <w:b w:val="0"/>
-          <w:i w:val="0"/>
-          <w:smallCaps w:val="0"/>
-          <w:strike w:val="0"/>
-          <w:color w:val="000000"/>
-          <w:sz w:val="24"/>
-          <w:szCs w:val="24"/>
-          <w:u w:val="none"/>
-          <w:shd w:fill="auto" w:val="clear"/>
-          <w:vertAlign w:val="baseline"/>
-          <w:rtl w:val="0"/>
-        </w:rPr>
-        <w:t xml:space="preserve">Worked with highly sensitive and accurate information.</w:t>
-      </w:r>
-    </w:p>
-    <w:p>
-      <w:pPr>
-        <w:keepNext w:val="0"/>
-        <w:keepLines w:val="0"/>
-        <w:pageBreakBefore w:val="0"/>
-        <w:widowControl w:val="1"/>
-        <w:numPr>
-          <w:ilvl w:val="0"/>
-          <w:numId w:val="1"/>
-        </w:numPr>
-        <w:pBdr>
-          <w:top w:space="0" w:sz="0" w:val="nil"/>
-          <w:left w:space="0" w:sz="0" w:val="nil"/>
-          <w:bottom w:space="0" w:sz="0" w:val="nil"/>
-          <w:right w:space="0" w:sz="0" w:val="nil"/>
-          <w:between w:space="0" w:sz="0" w:val="nil"/>
-        </w:pBdr>
-        <w:shd w:fill="auto" w:val="clear"/>
-        <w:tabs>
-          <w:tab w:val="center" w:leader="none" w:pos="-4770"/>
-          <w:tab w:val="left" w:leader="none" w:pos="-2970"/>
-          <w:tab w:val="left" w:leader="none" w:pos="-2610"/>
-          <w:tab w:val="left" w:leader="none" w:pos="-270"/>
-          <w:tab w:val="left" w:leader="none" w:pos="360"/>
-        </w:tabs>
-        <w:spacing w:after="0" w:before="0" w:line="240" w:lineRule="auto"/>
-        <w:ind w:left="720" w:right="-360" w:hanging="360"/>
-        <w:jc w:val="left"/>
-        <w:rPr>
-          <w:rFonts w:ascii="Calibri" w:cs="Calibri" w:eastAsia="Calibri" w:hAnsi="Calibri"/>
-          <w:b w:val="0"/>
-          <w:i w:val="0"/>
-          <w:smallCaps w:val="0"/>
-          <w:strike w:val="0"/>
-          <w:color w:val="000000"/>
-          <w:sz w:val="24"/>
-          <w:szCs w:val="24"/>
-          <w:u w:val="none"/>
-          <w:shd w:fill="auto" w:val="clear"/>
-          <w:vertAlign w:val="baseline"/>
-        </w:rPr>
-      </w:pPr>
-      <w:r>
-        <w:rPr>
-          <w:rFonts w:ascii="Calibri" w:cs="Calibri" w:eastAsia="Calibri" w:hAnsi="Calibri"/>
-          <w:b w:val="0"/>
-          <w:i w:val="0"/>
-          <w:smallCaps w:val="0"/>
-          <w:strike w:val="0"/>
-          <w:color w:val="000000"/>
-          <w:sz w:val="24"/>
-          <w:szCs w:val="24"/>
-          <w:u w:val="none"/>
-          <w:shd w:fill="auto" w:val="clear"/>
-          <w:vertAlign w:val="baseline"/>
-          <w:rtl w:val="0"/>
-        </w:rPr>
-        <w:t xml:space="preserve">Wrote VBA scripts to automate Excel work.</w:t>
       </w:r>
     </w:p>
     <w:p>
@@ -1802,6 +1698,546 @@
         <w:rPr>
           <w:rtl w:val="0"/>
         </w:rPr>
+      </w:r>
+    </w:p>
+    <w:p>
+      <w:pPr>
+        <w:tabs>
+          <w:tab w:val="center" w:leader="none" w:pos="-4770"/>
+          <w:tab w:val="left" w:leader="none" w:pos="360"/>
+        </w:tabs>
+        <w:ind w:left="720" w:right="-360" w:firstLine="0"/>
+        <w:rPr>
+          <w:rFonts w:ascii="Calibri" w:cs="Calibri" w:eastAsia="Calibri" w:hAnsi="Calibri"/>
+          <w:sz w:val="24"/>
+          <w:szCs w:val="24"/>
+        </w:rPr>
+      </w:pPr>
+      <w:r>
+        <w:br w:type="page"/>
+      </w:r>
+      <w:r>
+        <w:rPr>
+          <w:rtl w:val="0"/>
+        </w:rPr>
+      </w:r>
+    </w:p>
+    <w:p>
+      <w:pPr>
+        <w:tabs>
+          <w:tab w:val="center" w:leader="none" w:pos="-4770"/>
+          <w:tab w:val="left" w:leader="none" w:pos="360"/>
+        </w:tabs>
+        <w:ind w:left="720" w:right="-360" w:firstLine="0"/>
+        <w:rPr>
+          <w:rFonts w:ascii="Calibri" w:cs="Calibri" w:eastAsia="Calibri" w:hAnsi="Calibri"/>
+          <w:sz w:val="24"/>
+          <w:szCs w:val="24"/>
+        </w:rPr>
+      </w:pPr>
+      <w:r>
+        <w:rPr>
+          <w:rtl w:val="0"/>
+        </w:rPr>
+      </w:r>
+    </w:p>
+    <w:p>
+      <w:pPr>
+        <w:ind w:left="1890"/>
+        <w:rPr>
+          <w:rFonts w:ascii="Calibri" w:cs="Calibri" w:eastAsia="Calibri" w:hAnsi="Calibri"/>
+          <w:sz w:val="24"/>
+          <w:szCs w:val="24"/>
+        </w:rPr>
+      </w:pPr>
+      <w:r>
+        <w:rPr>
+          <w:rFonts w:ascii="Cambria" w:cs="Cambria" w:eastAsia="Cambria" w:hAnsi="Cambria"/>
+          <w:b w:val="1"/>
+          <w:rtl w:val="0"/>
+        </w:rPr>
+        <w:t xml:space="preserve">TECHNICAL SKILLS</w:t>
+      </w:r>
+      <w:r>
+        <w:rPr>
+          <w:rtl w:val="0"/>
+        </w:rPr>
+      </w:r>
+    </w:p>
+    <w:p>
+      <w:pPr>
+        <w:numPr>
+          <w:ilvl w:val="0"/>
+          <w:numId w:val="2"/>
+        </w:numPr>
+        <w:ind w:left="720" w:hanging="360"/>
+        <w:rPr>
+          <w:rFonts w:ascii="Calibri" w:cs="Calibri" w:eastAsia="Calibri" w:hAnsi="Calibri"/>
+          <w:sz w:val="24"/>
+          <w:szCs w:val="24"/>
+          <w:u w:val="none"/>
+        </w:rPr>
+      </w:pPr>
+      <w:r>
+        <w:rPr>
+          <w:rFonts w:ascii="Calibri" w:cs="Calibri" w:eastAsia="Calibri" w:hAnsi="Calibri"/>
+          <w:b w:val="1"/>
+          <w:sz w:val="24"/>
+          <w:szCs w:val="24"/>
+          <w:rtl w:val="0"/>
+        </w:rPr>
+        <w:t xml:space="preserve">Languages:</w:t>
+      </w:r>
+      <w:r>
+        <w:rPr>
+          <w:rFonts w:ascii="Calibri" w:cs="Calibri" w:eastAsia="Calibri" w:hAnsi="Calibri"/>
+          <w:sz w:val="24"/>
+          <w:szCs w:val="24"/>
+          <w:rtl w:val="0"/>
+        </w:rPr>
+        <w:t xml:space="preserve"> C#, JavaScript / TypeScript, SQL, Java, Python, PHP, Classic ASP, HTML, CSS</w:t>
+      </w:r>
+    </w:p>
+    <w:p>
+      <w:pPr>
+        <w:numPr>
+          <w:ilvl w:val="0"/>
+          <w:numId w:val="2"/>
+        </w:numPr>
+        <w:ind w:left="720" w:hanging="360"/>
+        <w:rPr>
+          <w:rFonts w:ascii="Calibri" w:cs="Calibri" w:eastAsia="Calibri" w:hAnsi="Calibri"/>
+          <w:sz w:val="24"/>
+          <w:szCs w:val="24"/>
+          <w:u w:val="none"/>
+        </w:rPr>
+      </w:pPr>
+      <w:r>
+        <w:rPr>
+          <w:rFonts w:ascii="Calibri" w:cs="Calibri" w:eastAsia="Calibri" w:hAnsi="Calibri"/>
+          <w:b w:val="1"/>
+          <w:sz w:val="24"/>
+          <w:szCs w:val="24"/>
+          <w:rtl w:val="0"/>
+        </w:rPr>
+        <w:t xml:space="preserve">Frameworks &amp; Libraries:</w:t>
+      </w:r>
+      <w:r>
+        <w:rPr>
+          <w:rFonts w:ascii="Calibri" w:cs="Calibri" w:eastAsia="Calibri" w:hAnsi="Calibri"/>
+          <w:sz w:val="24"/>
+          <w:szCs w:val="24"/>
+          <w:rtl w:val="0"/>
+        </w:rPr>
+        <w:t xml:space="preserve"> .NET / ASP.NET MVC &amp; Web API, React, Node.js, Spring, Hibernate, MSTest, xUnit, Bootstrap, jQuery</w:t>
+      </w:r>
+    </w:p>
+    <w:p>
+      <w:pPr>
+        <w:numPr>
+          <w:ilvl w:val="0"/>
+          <w:numId w:val="2"/>
+        </w:numPr>
+        <w:ind w:left="720" w:hanging="360"/>
+        <w:rPr>
+          <w:rFonts w:ascii="Calibri" w:cs="Calibri" w:eastAsia="Calibri" w:hAnsi="Calibri"/>
+          <w:sz w:val="24"/>
+          <w:szCs w:val="24"/>
+          <w:u w:val="none"/>
+        </w:rPr>
+      </w:pPr>
+      <w:r>
+        <w:rPr>
+          <w:rFonts w:ascii="Calibri" w:cs="Calibri" w:eastAsia="Calibri" w:hAnsi="Calibri"/>
+          <w:b w:val="1"/>
+          <w:sz w:val="24"/>
+          <w:szCs w:val="24"/>
+          <w:rtl w:val="0"/>
+        </w:rPr>
+        <w:t xml:space="preserve">Cloud &amp; DevOps:</w:t>
+      </w:r>
+      <w:r>
+        <w:rPr>
+          <w:rFonts w:ascii="Calibri" w:cs="Calibri" w:eastAsia="Calibri" w:hAnsi="Calibri"/>
+          <w:sz w:val="24"/>
+          <w:szCs w:val="24"/>
+          <w:rtl w:val="0"/>
+        </w:rPr>
+        <w:t xml:space="preserve"> Azure DevOps (Repos, Pipelines, Boards), Kubernetes, Docker, build &amp; release templating, artifact/version management, environment promotion workflows, CI/CD</w:t>
+      </w:r>
+    </w:p>
+    <w:p>
+      <w:pPr>
+        <w:numPr>
+          <w:ilvl w:val="0"/>
+          <w:numId w:val="2"/>
+        </w:numPr>
+        <w:ind w:left="720" w:hanging="360"/>
+        <w:rPr>
+          <w:rFonts w:ascii="Calibri" w:cs="Calibri" w:eastAsia="Calibri" w:hAnsi="Calibri"/>
+          <w:sz w:val="24"/>
+          <w:szCs w:val="24"/>
+          <w:u w:val="none"/>
+        </w:rPr>
+      </w:pPr>
+      <w:r>
+        <w:rPr>
+          <w:rFonts w:ascii="Calibri" w:cs="Calibri" w:eastAsia="Calibri" w:hAnsi="Calibri"/>
+          <w:b w:val="1"/>
+          <w:sz w:val="24"/>
+          <w:szCs w:val="24"/>
+          <w:rtl w:val="0"/>
+        </w:rPr>
+        <w:t xml:space="preserve">Data &amp; Persistence:</w:t>
+      </w:r>
+      <w:r>
+        <w:rPr>
+          <w:rFonts w:ascii="Calibri" w:cs="Calibri" w:eastAsia="Calibri" w:hAnsi="Calibri"/>
+          <w:sz w:val="24"/>
+          <w:szCs w:val="24"/>
+          <w:rtl w:val="0"/>
+        </w:rPr>
+        <w:t xml:space="preserve"> SQL Server, relational modeling, migration scripting, bulk ingestion (SDF, CSV, XML, JSON)</w:t>
+      </w:r>
+    </w:p>
+    <w:p>
+      <w:pPr>
+        <w:numPr>
+          <w:ilvl w:val="0"/>
+          <w:numId w:val="2"/>
+        </w:numPr>
+        <w:ind w:left="720" w:hanging="360"/>
+        <w:rPr>
+          <w:rFonts w:ascii="Calibri" w:cs="Calibri" w:eastAsia="Calibri" w:hAnsi="Calibri"/>
+          <w:sz w:val="24"/>
+          <w:szCs w:val="24"/>
+          <w:u w:val="none"/>
+        </w:rPr>
+      </w:pPr>
+      <w:r>
+        <w:rPr>
+          <w:rFonts w:ascii="Calibri" w:cs="Calibri" w:eastAsia="Calibri" w:hAnsi="Calibri"/>
+          <w:b w:val="1"/>
+          <w:sz w:val="24"/>
+          <w:szCs w:val="24"/>
+          <w:rtl w:val="0"/>
+        </w:rPr>
+        <w:t xml:space="preserve">Search &amp; Analytics:</w:t>
+      </w:r>
+      <w:r>
+        <w:rPr>
+          <w:rFonts w:ascii="Calibri" w:cs="Calibri" w:eastAsia="Calibri" w:hAnsi="Calibri"/>
+          <w:sz w:val="24"/>
+          <w:szCs w:val="24"/>
+          <w:rtl w:val="0"/>
+        </w:rPr>
+        <w:t xml:space="preserve"> full-text search integration, structured &amp; predicate search, performance &amp; relevance tuning, export pipelines</w:t>
+      </w:r>
+    </w:p>
+    <w:p>
+      <w:pPr>
+        <w:numPr>
+          <w:ilvl w:val="0"/>
+          <w:numId w:val="2"/>
+        </w:numPr>
+        <w:ind w:left="720" w:hanging="360"/>
+        <w:rPr>
+          <w:rFonts w:ascii="Calibri" w:cs="Calibri" w:eastAsia="Calibri" w:hAnsi="Calibri"/>
+          <w:sz w:val="24"/>
+          <w:szCs w:val="24"/>
+          <w:u w:val="none"/>
+        </w:rPr>
+      </w:pPr>
+      <w:r>
+        <w:rPr>
+          <w:rFonts w:ascii="Calibri" w:cs="Calibri" w:eastAsia="Calibri" w:hAnsi="Calibri"/>
+          <w:b w:val="1"/>
+          <w:sz w:val="24"/>
+          <w:szCs w:val="24"/>
+          <w:rtl w:val="0"/>
+        </w:rPr>
+        <w:t xml:space="preserve">Chemistry / Scientific Domain:</w:t>
+      </w:r>
+      <w:r>
+        <w:rPr>
+          <w:rFonts w:ascii="Calibri" w:cs="Calibri" w:eastAsia="Calibri" w:hAnsi="Calibri"/>
+          <w:sz w:val="24"/>
+          <w:szCs w:val="24"/>
+          <w:rtl w:val="0"/>
+        </w:rPr>
+        <w:t xml:space="preserve"> CDXML conversions, salts &amp; stereochemistry normalization, stoichiometry &amp; reaction data modeling, structure property hashing, sequence validation workflows</w:t>
+      </w:r>
+    </w:p>
+    <w:p>
+      <w:pPr>
+        <w:numPr>
+          <w:ilvl w:val="0"/>
+          <w:numId w:val="2"/>
+        </w:numPr>
+        <w:ind w:left="720" w:hanging="360"/>
+        <w:rPr>
+          <w:rFonts w:ascii="Calibri" w:cs="Calibri" w:eastAsia="Calibri" w:hAnsi="Calibri"/>
+          <w:sz w:val="24"/>
+          <w:szCs w:val="24"/>
+          <w:u w:val="none"/>
+        </w:rPr>
+      </w:pPr>
+      <w:r>
+        <w:rPr>
+          <w:rFonts w:ascii="Calibri" w:cs="Calibri" w:eastAsia="Calibri" w:hAnsi="Calibri"/>
+          <w:b w:val="1"/>
+          <w:sz w:val="24"/>
+          <w:szCs w:val="24"/>
+          <w:rtl w:val="0"/>
+        </w:rPr>
+        <w:t xml:space="preserve">Security &amp; Identity:</w:t>
+      </w:r>
+      <w:r>
+        <w:rPr>
+          <w:rFonts w:ascii="Calibri" w:cs="Calibri" w:eastAsia="Calibri" w:hAnsi="Calibri"/>
+          <w:sz w:val="24"/>
+          <w:szCs w:val="24"/>
+          <w:rtl w:val="0"/>
+        </w:rPr>
+        <w:t xml:space="preserve"> SAML SSO, role &amp; permission gating, secure config &amp; secrets handling, data privacy (PII minimization)</w:t>
+      </w:r>
+    </w:p>
+    <w:p>
+      <w:pPr>
+        <w:numPr>
+          <w:ilvl w:val="0"/>
+          <w:numId w:val="2"/>
+        </w:numPr>
+        <w:ind w:left="720" w:hanging="360"/>
+        <w:rPr>
+          <w:rFonts w:ascii="Calibri" w:cs="Calibri" w:eastAsia="Calibri" w:hAnsi="Calibri"/>
+          <w:sz w:val="24"/>
+          <w:szCs w:val="24"/>
+          <w:u w:val="none"/>
+        </w:rPr>
+      </w:pPr>
+      <w:r>
+        <w:rPr>
+          <w:rFonts w:ascii="Calibri" w:cs="Calibri" w:eastAsia="Calibri" w:hAnsi="Calibri"/>
+          <w:b w:val="1"/>
+          <w:sz w:val="24"/>
+          <w:szCs w:val="24"/>
+          <w:rtl w:val="0"/>
+        </w:rPr>
+        <w:t xml:space="preserve">Quality Engineering:</w:t>
+      </w:r>
+      <w:r>
+        <w:rPr>
+          <w:rFonts w:ascii="Calibri" w:cs="Calibri" w:eastAsia="Calibri" w:hAnsi="Calibri"/>
+          <w:sz w:val="24"/>
+          <w:szCs w:val="24"/>
+          <w:rtl w:val="0"/>
+        </w:rPr>
+        <w:t xml:space="preserve"> Unit / integration testing, Postman multi-environment API suites, coverage instrumentation (Coverlet), static analysis (SonarQube), test data strategy</w:t>
+      </w:r>
+    </w:p>
+    <w:p>
+      <w:pPr>
+        <w:numPr>
+          <w:ilvl w:val="0"/>
+          <w:numId w:val="2"/>
+        </w:numPr>
+        <w:ind w:left="720" w:hanging="360"/>
+        <w:rPr>
+          <w:rFonts w:ascii="Calibri" w:cs="Calibri" w:eastAsia="Calibri" w:hAnsi="Calibri"/>
+          <w:sz w:val="24"/>
+          <w:szCs w:val="24"/>
+          <w:u w:val="none"/>
+        </w:rPr>
+      </w:pPr>
+      <w:r>
+        <w:rPr>
+          <w:rFonts w:ascii="Calibri" w:cs="Calibri" w:eastAsia="Calibri" w:hAnsi="Calibri"/>
+          <w:b w:val="1"/>
+          <w:sz w:val="24"/>
+          <w:szCs w:val="24"/>
+          <w:rtl w:val="0"/>
+        </w:rPr>
+        <w:t xml:space="preserve">Observability &amp; Diagnostics:</w:t>
+      </w:r>
+      <w:r>
+        <w:rPr>
+          <w:rFonts w:ascii="Calibri" w:cs="Calibri" w:eastAsia="Calibri" w:hAnsi="Calibri"/>
+          <w:sz w:val="24"/>
+          <w:szCs w:val="24"/>
+          <w:rtl w:val="0"/>
+        </w:rPr>
+        <w:t xml:space="preserve"> Structured logging, performance instrumentation, interface log services, error taxonomy &amp; tracing</w:t>
+      </w:r>
+    </w:p>
+    <w:p>
+      <w:pPr>
+        <w:numPr>
+          <w:ilvl w:val="0"/>
+          <w:numId w:val="2"/>
+        </w:numPr>
+        <w:ind w:left="720" w:hanging="360"/>
+        <w:rPr>
+          <w:rFonts w:ascii="Calibri" w:cs="Calibri" w:eastAsia="Calibri" w:hAnsi="Calibri"/>
+          <w:sz w:val="24"/>
+          <w:szCs w:val="24"/>
+          <w:u w:val="none"/>
+        </w:rPr>
+      </w:pPr>
+      <w:r>
+        <w:rPr>
+          <w:rFonts w:ascii="Calibri" w:cs="Calibri" w:eastAsia="Calibri" w:hAnsi="Calibri"/>
+          <w:b w:val="1"/>
+          <w:sz w:val="24"/>
+          <w:szCs w:val="24"/>
+          <w:rtl w:val="0"/>
+        </w:rPr>
+        <w:t xml:space="preserve">Performance &amp; Reliability: </w:t>
+      </w:r>
+      <w:r>
+        <w:rPr>
+          <w:rFonts w:ascii="Calibri" w:cs="Calibri" w:eastAsia="Calibri" w:hAnsi="Calibri"/>
+          <w:sz w:val="24"/>
+          <w:szCs w:val="24"/>
+          <w:rtl w:val="0"/>
+        </w:rPr>
+        <w:t xml:space="preserve">Hotspot profiling (ORM/SQL), pagination &amp; batching strategies, resilient bulk import/update pipelines, defensive validation</w:t>
+      </w:r>
+    </w:p>
+    <w:p>
+      <w:pPr>
+        <w:numPr>
+          <w:ilvl w:val="0"/>
+          <w:numId w:val="2"/>
+        </w:numPr>
+        <w:ind w:left="720" w:hanging="360"/>
+        <w:rPr>
+          <w:rFonts w:ascii="Calibri" w:cs="Calibri" w:eastAsia="Calibri" w:hAnsi="Calibri"/>
+          <w:sz w:val="24"/>
+          <w:szCs w:val="24"/>
+          <w:u w:val="none"/>
+        </w:rPr>
+      </w:pPr>
+      <w:r>
+        <w:rPr>
+          <w:rFonts w:ascii="Calibri" w:cs="Calibri" w:eastAsia="Calibri" w:hAnsi="Calibri"/>
+          <w:b w:val="1"/>
+          <w:sz w:val="24"/>
+          <w:szCs w:val="24"/>
+          <w:rtl w:val="0"/>
+        </w:rPr>
+        <w:t xml:space="preserve">Automation &amp; Scripting:</w:t>
+      </w:r>
+      <w:r>
+        <w:rPr>
+          <w:rFonts w:ascii="Calibri" w:cs="Calibri" w:eastAsia="Calibri" w:hAnsi="Calibri"/>
+          <w:sz w:val="24"/>
+          <w:szCs w:val="24"/>
+          <w:rtl w:val="0"/>
+        </w:rPr>
+        <w:t xml:space="preserve"> Data migration &amp; normalization scripts, indexing/reindexing utilities, health &amp; monitoring scripts, build/deployment helpers</w:t>
+      </w:r>
+    </w:p>
+    <w:p>
+      <w:pPr>
+        <w:numPr>
+          <w:ilvl w:val="0"/>
+          <w:numId w:val="2"/>
+        </w:numPr>
+        <w:ind w:left="720" w:hanging="360"/>
+        <w:rPr>
+          <w:rFonts w:ascii="Calibri" w:cs="Calibri" w:eastAsia="Calibri" w:hAnsi="Calibri"/>
+          <w:sz w:val="24"/>
+          <w:szCs w:val="24"/>
+          <w:u w:val="none"/>
+        </w:rPr>
+      </w:pPr>
+      <w:r>
+        <w:rPr>
+          <w:rFonts w:ascii="Calibri" w:cs="Calibri" w:eastAsia="Calibri" w:hAnsi="Calibri"/>
+          <w:b w:val="1"/>
+          <w:sz w:val="24"/>
+          <w:szCs w:val="24"/>
+          <w:rtl w:val="0"/>
+        </w:rPr>
+        <w:t xml:space="preserve">Modernization &amp; Legacy Remediation:</w:t>
+      </w:r>
+      <w:r>
+        <w:rPr>
+          <w:rFonts w:ascii="Calibri" w:cs="Calibri" w:eastAsia="Calibri" w:hAnsi="Calibri"/>
+          <w:sz w:val="24"/>
+          <w:szCs w:val="24"/>
+          <w:rtl w:val="0"/>
+        </w:rPr>
+        <w:t xml:space="preserve"> Classic ASP / PHP to service + React transitions, incremental migration approaches, risk-managed refactors</w:t>
+      </w:r>
+    </w:p>
+    <w:p>
+      <w:pPr>
+        <w:numPr>
+          <w:ilvl w:val="0"/>
+          <w:numId w:val="2"/>
+        </w:numPr>
+        <w:ind w:left="720" w:hanging="360"/>
+        <w:rPr>
+          <w:rFonts w:ascii="Calibri" w:cs="Calibri" w:eastAsia="Calibri" w:hAnsi="Calibri"/>
+          <w:sz w:val="24"/>
+          <w:szCs w:val="24"/>
+          <w:u w:val="none"/>
+        </w:rPr>
+      </w:pPr>
+      <w:r>
+        <w:rPr>
+          <w:rFonts w:ascii="Calibri" w:cs="Calibri" w:eastAsia="Calibri" w:hAnsi="Calibri"/>
+          <w:b w:val="1"/>
+          <w:sz w:val="24"/>
+          <w:szCs w:val="24"/>
+          <w:rtl w:val="0"/>
+        </w:rPr>
+        <w:t xml:space="preserve">Collaboration &amp; Practices:</w:t>
+      </w:r>
+      <w:r>
+        <w:rPr>
+          <w:rFonts w:ascii="Calibri" w:cs="Calibri" w:eastAsia="Calibri" w:hAnsi="Calibri"/>
+          <w:sz w:val="24"/>
+          <w:szCs w:val="24"/>
+          <w:rtl w:val="0"/>
+        </w:rPr>
+        <w:t xml:space="preserve"> Code reviews, technical mentorship, Agile iteration planning, documentation, incremental delivery &amp; rollout strategy</w:t>
+      </w:r>
+    </w:p>
+    <w:p>
+      <w:pPr>
+        <w:numPr>
+          <w:ilvl w:val="0"/>
+          <w:numId w:val="2"/>
+        </w:numPr>
+        <w:ind w:left="720" w:hanging="360"/>
+        <w:rPr>
+          <w:rFonts w:ascii="Calibri" w:cs="Calibri" w:eastAsia="Calibri" w:hAnsi="Calibri"/>
+          <w:sz w:val="24"/>
+          <w:szCs w:val="24"/>
+          <w:u w:val="none"/>
+        </w:rPr>
+      </w:pPr>
+      <w:r>
+        <w:rPr>
+          <w:rFonts w:ascii="Calibri" w:cs="Calibri" w:eastAsia="Calibri" w:hAnsi="Calibri"/>
+          <w:b w:val="1"/>
+          <w:sz w:val="24"/>
+          <w:szCs w:val="24"/>
+          <w:rtl w:val="0"/>
+        </w:rPr>
+        <w:t xml:space="preserve">Internationalization:</w:t>
+      </w:r>
+      <w:r>
+        <w:rPr>
+          <w:rFonts w:ascii="Calibri" w:cs="Calibri" w:eastAsia="Calibri" w:hAnsi="Calibri"/>
+          <w:sz w:val="24"/>
+          <w:szCs w:val="24"/>
+          <w:rtl w:val="0"/>
+        </w:rPr>
+        <w:t xml:space="preserve"> Locale expansion, culture defaults, translation integration, user preference handling</w:t>
       </w:r>
     </w:p>
     <w:sectPr>
@@ -1932,7 +2368,7 @@
       <w:lvlText w:val="●"/>
       <w:lvlJc w:val="left"/>
       <w:pPr>
-        <w:ind w:left="720" w:hanging="360"/>
+        <w:ind w:left="1440" w:hanging="360"/>
       </w:pPr>
       <w:rPr>
         <w:u w:val="none"/>
@@ -1944,7 +2380,7 @@
       <w:lvlText w:val="○"/>
       <w:lvlJc w:val="left"/>
       <w:pPr>
-        <w:ind w:left="1440" w:hanging="360"/>
+        <w:ind w:left="2160" w:hanging="360"/>
       </w:pPr>
       <w:rPr>
         <w:u w:val="none"/>
@@ -1956,7 +2392,7 @@
       <w:lvlText w:val="■"/>
       <w:lvlJc w:val="left"/>
       <w:pPr>
-        <w:ind w:left="2160" w:hanging="360"/>
+        <w:ind w:left="2880" w:hanging="360"/>
       </w:pPr>
       <w:rPr>
         <w:u w:val="none"/>
@@ -1968,7 +2404,7 @@
       <w:lvlText w:val="●"/>
       <w:lvlJc w:val="left"/>
       <w:pPr>
-        <w:ind w:left="2880" w:hanging="360"/>
+        <w:ind w:left="3600" w:hanging="360"/>
       </w:pPr>
       <w:rPr>
         <w:u w:val="none"/>
@@ -1980,7 +2416,7 @@
       <w:lvlText w:val="○"/>
       <w:lvlJc w:val="left"/>
       <w:pPr>
-        <w:ind w:left="3600" w:hanging="360"/>
+        <w:ind w:left="4320" w:hanging="360"/>
       </w:pPr>
       <w:rPr>
         <w:u w:val="none"/>
@@ -1992,7 +2428,7 @@
       <w:lvlText w:val="■"/>
       <w:lvlJc w:val="left"/>
       <w:pPr>
-        <w:ind w:left="4320" w:hanging="360"/>
+        <w:ind w:left="5040" w:hanging="360"/>
       </w:pPr>
       <w:rPr>
         <w:u w:val="none"/>
@@ -2004,7 +2440,7 @@
       <w:lvlText w:val="●"/>
       <w:lvlJc w:val="left"/>
       <w:pPr>
-        <w:ind w:left="5040" w:hanging="360"/>
+        <w:ind w:left="5760" w:hanging="360"/>
       </w:pPr>
       <w:rPr>
         <w:u w:val="none"/>
@@ -2016,7 +2452,7 @@
       <w:lvlText w:val="○"/>
       <w:lvlJc w:val="left"/>
       <w:pPr>
-        <w:ind w:left="5760" w:hanging="360"/>
+        <w:ind w:left="6480" w:hanging="360"/>
       </w:pPr>
       <w:rPr>
         <w:u w:val="none"/>
@@ -2028,7 +2464,7 @@
       <w:lvlText w:val="■"/>
       <w:lvlJc w:val="left"/>
       <w:pPr>
-        <w:ind w:left="6480" w:hanging="360"/>
+        <w:ind w:left="7200" w:hanging="360"/>
       </w:pPr>
       <w:rPr>
         <w:u w:val="none"/>
@@ -2366,116 +2802,6 @@
     </w:lvl>
   </w:abstractNum>
   <w:abstractNum w:abstractNumId="6">
-    <w:lvl w:ilvl="0">
-      <w:start w:val="1"/>
-      <w:numFmt w:val="bullet"/>
-      <w:lvlText w:val="●"/>
-      <w:lvlJc w:val="left"/>
-      <w:pPr>
-        <w:ind w:left="720" w:hanging="360"/>
-      </w:pPr>
-      <w:rPr>
-        <w:u w:val="none"/>
-      </w:rPr>
-    </w:lvl>
-    <w:lvl w:ilvl="1">
-      <w:start w:val="1"/>
-      <w:numFmt w:val="bullet"/>
-      <w:lvlText w:val="○"/>
-      <w:lvlJc w:val="left"/>
-      <w:pPr>
-        <w:ind w:left="1440" w:hanging="360"/>
-      </w:pPr>
-      <w:rPr>
-        <w:u w:val="none"/>
-      </w:rPr>
-    </w:lvl>
-    <w:lvl w:ilvl="2">
-      <w:start w:val="1"/>
-      <w:numFmt w:val="bullet"/>
-      <w:lvlText w:val="■"/>
-      <w:lvlJc w:val="left"/>
-      <w:pPr>
-        <w:ind w:left="2160" w:hanging="360"/>
-      </w:pPr>
-      <w:rPr>
-        <w:u w:val="none"/>
-      </w:rPr>
-    </w:lvl>
-    <w:lvl w:ilvl="3">
-      <w:start w:val="1"/>
-      <w:numFmt w:val="bullet"/>
-      <w:lvlText w:val="●"/>
-      <w:lvlJc w:val="left"/>
-      <w:pPr>
-        <w:ind w:left="2880" w:hanging="360"/>
-      </w:pPr>
-      <w:rPr>
-        <w:u w:val="none"/>
-      </w:rPr>
-    </w:lvl>
-    <w:lvl w:ilvl="4">
-      <w:start w:val="1"/>
-      <w:numFmt w:val="bullet"/>
-      <w:lvlText w:val="○"/>
-      <w:lvlJc w:val="left"/>
-      <w:pPr>
-        <w:ind w:left="3600" w:hanging="360"/>
-      </w:pPr>
-      <w:rPr>
-        <w:u w:val="none"/>
-      </w:rPr>
-    </w:lvl>
-    <w:lvl w:ilvl="5">
-      <w:start w:val="1"/>
-      <w:numFmt w:val="bullet"/>
-      <w:lvlText w:val="■"/>
-      <w:lvlJc w:val="left"/>
-      <w:pPr>
-        <w:ind w:left="4320" w:hanging="360"/>
-      </w:pPr>
-      <w:rPr>
-        <w:u w:val="none"/>
-      </w:rPr>
-    </w:lvl>
-    <w:lvl w:ilvl="6">
-      <w:start w:val="1"/>
-      <w:numFmt w:val="bullet"/>
-      <w:lvlText w:val="●"/>
-      <w:lvlJc w:val="left"/>
-      <w:pPr>
-        <w:ind w:left="5040" w:hanging="360"/>
-      </w:pPr>
-      <w:rPr>
-        <w:u w:val="none"/>
-      </w:rPr>
-    </w:lvl>
-    <w:lvl w:ilvl="7">
-      <w:start w:val="1"/>
-      <w:numFmt w:val="bullet"/>
-      <w:lvlText w:val="○"/>
-      <w:lvlJc w:val="left"/>
-      <w:pPr>
-        <w:ind w:left="5760" w:hanging="360"/>
-      </w:pPr>
-      <w:rPr>
-        <w:u w:val="none"/>
-      </w:rPr>
-    </w:lvl>
-    <w:lvl w:ilvl="8">
-      <w:start w:val="1"/>
-      <w:numFmt w:val="bullet"/>
-      <w:lvlText w:val="■"/>
-      <w:lvlJc w:val="left"/>
-      <w:pPr>
-        <w:ind w:left="6480" w:hanging="360"/>
-      </w:pPr>
-      <w:rPr>
-        <w:u w:val="none"/>
-      </w:rPr>
-    </w:lvl>
-  </w:abstractNum>
-  <w:abstractNum w:abstractNumId="7">
     <w:lvl w:ilvl="0">
       <w:start w:val="1"/>
       <w:numFmt w:val="bullet"/>
@@ -2603,9 +2929,6 @@
   <w:num w:numId="6">
     <w:abstractNumId w:val="6"/>
   </w:num>
-  <w:num w:numId="7">
-    <w:abstractNumId w:val="7"/>
-  </w:num>
 </w:numbering>
 </file>
 
@@ -2621,11 +2944,19 @@
       <w:pPr/>
     </w:pPrDefault>
   </w:docDefaults>
+  <w:style w:type="table" w:styleId="TableNormal" w:default="1">
+    <w:name w:val="TableNormal"/>
+    <w:tblPr>
+      <w:tblCellMar>
+        <w:top w:w="100.0" w:type="dxa"/>
+        <w:left w:w="100.0" w:type="dxa"/>
+        <w:bottom w:w="100.0" w:type="dxa"/>
+        <w:right w:w="100.0" w:type="dxa"/>
+      </w:tblCellMar>
+    </w:tblPr>
+  </w:style>
   <w:style w:type="paragraph" w:styleId="Normal" w:default="1">
     <w:name w:val="normal"/>
-  </w:style>
-  <w:style w:type="table" w:styleId="TableNormal" w:default="1">
-    <w:name w:val="TableNormal"/>
   </w:style>
   <w:style w:type="paragraph" w:styleId="Heading1">
     <w:name w:val="heading 1"/>

</xml_diff>

<commit_message>
Update download files to match the page
</commit_message>
<xml_diff>
--- a/doc/Shawn Burgess.docx
+++ b/doc/Shawn Burgess.docx
@@ -10,6 +10,7 @@
         <w:rPr>
           <w:rFonts w:ascii="Libre Franklin Medium" w:cs="Libre Franklin Medium" w:eastAsia="Libre Franklin Medium" w:hAnsi="Libre Franklin Medium"/>
           <w:b w:val="1"/>
+          <w:bCs w:val="1"/>
           <w:color w:val="f3f3f3"/>
           <w:sz w:val="44"/>
           <w:szCs w:val="44"/>
@@ -19,6 +20,7 @@
         <w:rPr>
           <w:rFonts w:ascii="Libre Franklin Medium" w:cs="Libre Franklin Medium" w:eastAsia="Libre Franklin Medium" w:hAnsi="Libre Franklin Medium"/>
           <w:b w:val="1"/>
+          <w:bCs w:val="1"/>
           <w:color w:val="f3f3f3"/>
           <w:sz w:val="44"/>
           <w:szCs w:val="44"/>
@@ -35,6 +37,7 @@
         <w:rPr>
           <w:rFonts w:ascii="Cambria" w:cs="Cambria" w:eastAsia="Cambria" w:hAnsi="Cambria"/>
           <w:b w:val="1"/>
+          <w:bCs w:val="1"/>
         </w:rPr>
       </w:pPr>
       <w:r>
@@ -114,6 +117,7 @@
         <w:rPr>
           <w:rFonts w:ascii="Cambria" w:cs="Cambria" w:eastAsia="Cambria" w:hAnsi="Cambria"/>
           <w:b w:val="1"/>
+          <w:bCs w:val="1"/>
           <w:rtl w:val="0"/>
         </w:rPr>
         <w:t xml:space="preserve">PROFESSIONAL SUMMARY:</w:t>
@@ -208,6 +212,7 @@
         <w:rPr>
           <w:rFonts w:ascii="Cambria" w:cs="Cambria" w:eastAsia="Cambria" w:hAnsi="Cambria"/>
           <w:b w:val="1"/>
+          <w:bCs w:val="1"/>
           <w:rtl w:val="0"/>
         </w:rPr>
         <w:t xml:space="preserve">STRENGTHS:</w:t>
@@ -258,12 +263,14 @@
         <w:rPr>
           <w:rFonts w:ascii="Cambria" w:cs="Cambria" w:eastAsia="Cambria" w:hAnsi="Cambria"/>
           <w:b w:val="1"/>
+          <w:bCs w:val="1"/>
         </w:rPr>
       </w:pPr>
       <w:r>
         <w:rPr>
           <w:rFonts w:ascii="Cambria" w:cs="Cambria" w:eastAsia="Cambria" w:hAnsi="Cambria"/>
           <w:b w:val="1"/>
+          <w:bCs w:val="1"/>
           <w:rtl w:val="0"/>
         </w:rPr>
         <w:t xml:space="preserve">PROFESSIONAL EXPERIENCE:</w:t>
@@ -280,14 +287,16 @@
         <w:rPr>
           <w:rFonts w:ascii="Calibri" w:cs="Calibri" w:eastAsia="Calibri" w:hAnsi="Calibri"/>
           <w:b w:val="1"/>
-          <w:sz w:val="24"/>
-          <w:szCs w:val="24"/>
-        </w:rPr>
-      </w:pPr>
-      <w:r>
-        <w:rPr>
-          <w:rFonts w:ascii="Calibri" w:cs="Calibri" w:eastAsia="Calibri" w:hAnsi="Calibri"/>
-          <w:b w:val="1"/>
+          <w:bCs w:val="1"/>
+          <w:sz w:val="24"/>
+          <w:szCs w:val="24"/>
+        </w:rPr>
+      </w:pPr>
+      <w:r>
+        <w:rPr>
+          <w:rFonts w:ascii="Calibri" w:cs="Calibri" w:eastAsia="Calibri" w:hAnsi="Calibri"/>
+          <w:b w:val="1"/>
+          <w:bCs w:val="1"/>
           <w:sz w:val="24"/>
           <w:szCs w:val="24"/>
           <w:rtl w:val="0"/>
@@ -321,14 +330,16 @@
         <w:rPr>
           <w:rFonts w:ascii="Calibri" w:cs="Calibri" w:eastAsia="Calibri" w:hAnsi="Calibri"/>
           <w:b w:val="1"/>
-          <w:sz w:val="24"/>
-          <w:szCs w:val="24"/>
-        </w:rPr>
-      </w:pPr>
-      <w:r>
-        <w:rPr>
-          <w:rFonts w:ascii="Calibri" w:cs="Calibri" w:eastAsia="Calibri" w:hAnsi="Calibri"/>
-          <w:b w:val="1"/>
+          <w:bCs w:val="1"/>
+          <w:sz w:val="24"/>
+          <w:szCs w:val="24"/>
+        </w:rPr>
+      </w:pPr>
+      <w:r>
+        <w:rPr>
+          <w:rFonts w:ascii="Calibri" w:cs="Calibri" w:eastAsia="Calibri" w:hAnsi="Calibri"/>
+          <w:b w:val="1"/>
+          <w:bCs w:val="1"/>
           <w:sz w:val="24"/>
           <w:szCs w:val="24"/>
           <w:rtl w:val="0"/>
@@ -362,7 +373,7 @@
           <w:szCs w:val="24"/>
           <w:rtl w:val="0"/>
         </w:rPr>
-        <w:t xml:space="preserve">Modernized multi-tenant ELN / registration platform: refactored core request &amp; configuration services for extensibility and performance.</w:t>
+        <w:t xml:space="preserve">Modernized multi-tenant ELN / registration platform from Classic ASP, PHP and Python 2 to .NET 4.5+ (C#, ASP.NET MVC/Web API) using Entity Framework, SQL Server, microservices and RESTful architecture to refactor core request &amp; configuration services for extensibility and performance.</w:t>
       </w:r>
     </w:p>
     <w:p>
@@ -391,7 +402,7 @@
           <w:szCs w:val="24"/>
           <w:rtl w:val="0"/>
         </w:rPr>
-        <w:t xml:space="preserve">Centralized chemistry processing: CDXML conversions, salt &amp; stereochemistry normalization, stoichiometry &amp; reaction APIs.</w:t>
+        <w:t xml:space="preserve">Centralized chemistry processing in C# Web API microservices (CDXML conversions, salt &amp; stereochemistry normalization, stoichiometry &amp; reaction endpoints) backed by SQL Server data models and structured logging for reliability.</w:t>
       </w:r>
     </w:p>
     <w:p>
@@ -420,7 +431,7 @@
           <w:szCs w:val="24"/>
           <w:rtl w:val="0"/>
         </w:rPr>
-        <w:t xml:space="preserve">Expanded registration workflows: parent/child lineage, gap-free numbering, stoichiometry grid, salts &amp; structure property derivation, sequence validation.</w:t>
+        <w:t xml:space="preserve">Expanded registration workflows (parent/child lineage, gap-free numbering, stoichiometry grid, salts &amp; property derivation, sequence validation) via React front-end integrated with .NET RESTful APIs and Entity Framework persistence.</w:t>
       </w:r>
     </w:p>
     <w:p>
@@ -449,7 +460,7 @@
           <w:szCs w:val="24"/>
           <w:rtl w:val="0"/>
         </w:rPr>
-        <w:t xml:space="preserve">Engineered resilient bulk import &amp; update pipelines (chem + bio sequences, SDF/SD, sub-data mapping, warning/error framework).</w:t>
+        <w:t xml:space="preserve">Engineered resilient bulk import &amp; update pipelines (chemistry + bio sequences, SDF/SD) using asynchronous C# processing, and a SQL Server database.</w:t>
       </w:r>
     </w:p>
     <w:p>
@@ -478,7 +489,7 @@
           <w:szCs w:val="24"/>
           <w:rtl w:val="0"/>
         </w:rPr>
-        <w:t xml:space="preserve">Led SAML SSO &amp; identity integration (enterprise metadata, multi-environment configs) streamlining customer onboarding.</w:t>
+        <w:t xml:space="preserve">Led SAML SSO &amp; identity integration to streamline customer's user authentication experience.</w:t>
       </w:r>
     </w:p>
     <w:p>
@@ -507,7 +518,7 @@
           <w:szCs w:val="24"/>
           <w:rtl w:val="0"/>
         </w:rPr>
-        <w:t xml:space="preserve">Built comprehensive Postman API test suite (multi-environment matrices + pipeline integration) raising regression confidence.</w:t>
+        <w:t xml:space="preserve">Built comprehensive Postman multi-environment API test suites integrated into Azure DevOps pipelines, improving regression confidence across microservice REST endpoints.</w:t>
       </w:r>
     </w:p>
     <w:p>
@@ -536,7 +547,7 @@
           <w:szCs w:val="24"/>
           <w:rtl w:val="0"/>
         </w:rPr>
-        <w:t xml:space="preserve">Strengthened unit &amp; integration test coverage; upgraded MSTest frameworks and introduced coverage tooling.</w:t>
+        <w:t xml:space="preserve">Strengthened unit &amp; integration test coverage with MSTest and Coverlet across .NET codebases, elevating quality and change safety.</w:t>
       </w:r>
     </w:p>
     <w:p>
@@ -565,7 +576,7 @@
           <w:szCs w:val="24"/>
           <w:rtl w:val="0"/>
         </w:rPr>
-        <w:t xml:space="preserve">Implemented feature flag strategy (stoichiometry, inventory linking, chemistry canvas, CAS / CRAIS checks) enabling incremental rollout.</w:t>
+        <w:t xml:space="preserve">Introduced structured logging, performance instrumentation and an interface log service across .NET Web API and front-end layers to accelerate diagnostics and reduce mean time to recovery.</w:t>
       </w:r>
     </w:p>
     <w:p>
@@ -594,7 +605,7 @@
           <w:szCs w:val="24"/>
           <w:rtl w:val="0"/>
         </w:rPr>
-        <w:t xml:space="preserve">Introduced structured logging, performance instrumentation &amp; interface log service improving diagnostics &amp; mean time to recovery.</w:t>
+        <w:t xml:space="preserve">Drove Azure DevOps pipeline templating and Kubernetes (Docker-based) deployment standardization for repeatable promotion and higher release reliability.</w:t>
       </w:r>
     </w:p>
     <w:p>
@@ -623,7 +634,7 @@
           <w:szCs w:val="24"/>
           <w:rtl w:val="0"/>
         </w:rPr>
-        <w:t xml:space="preserve">Drove Azure DevOps + Kubernetes delivery improvements: templated pipelines, repeatable promotion, deployment reliability.</w:t>
+        <w:t xml:space="preserve">Advanced internationalization (locale expansion, culture defaults) and data privacy (PII minimization) across JavaScript/TypeScript UI and .NET service layers.</w:t>
       </w:r>
     </w:p>
     <w:p>
@@ -652,7 +663,7 @@
           <w:szCs w:val="24"/>
           <w:rtl w:val="0"/>
         </w:rPr>
-        <w:t xml:space="preserve">Reduced technical debt across legacy Classic ASP / PHP / Python surfaces; migrated critical chem &amp; search logic to services.</w:t>
+        <w:t xml:space="preserve">Refined permission &amp; role gating (restricted search, inventory linking and visibility) enhancing security posture.</w:t>
       </w:r>
     </w:p>
     <w:p>
@@ -681,17 +692,102 @@
           <w:szCs w:val="24"/>
           <w:rtl w:val="0"/>
         </w:rPr>
-        <w:t xml:space="preserve">Advanced internationalization (new locales, culture defaults) and data privacy (PII minimization).</w:t>
-      </w:r>
-    </w:p>
-    <w:p>
-      <w:pPr>
-        <w:numPr>
-          <w:ilvl w:val="0"/>
-          <w:numId w:val="5"/>
-        </w:numPr>
-        <w:tabs>
-          <w:tab w:val="center" w:leader="none" w:pos="90"/>
+        <w:t xml:space="preserve">Mentored engineers in code review, observability patterns, and sustainable refactoring practices.</w:t>
+      </w:r>
+    </w:p>
+    <w:p>
+      <w:pPr>
+        <w:ind w:right="-360"/>
+        <w:rPr>
+          <w:rFonts w:ascii="Cambria" w:cs="Cambria" w:eastAsia="Cambria" w:hAnsi="Cambria"/>
+          <w:b w:val="1"/>
+          <w:bCs w:val="1"/>
+        </w:rPr>
+      </w:pPr>
+      <w:r>
+        <w:rPr>
+          <w:rtl w:val="0"/>
+        </w:rPr>
+      </w:r>
+    </w:p>
+    <w:p>
+      <w:pPr>
+        <w:shd w:fill="eeece1" w:val="clear"/>
+        <w:tabs>
+          <w:tab w:val="center" w:leader="none" w:pos="-4770"/>
+        </w:tabs>
+        <w:ind w:left="180" w:right="-360" w:firstLine="0"/>
+        <w:jc w:val="center"/>
+        <w:rPr>
+          <w:rFonts w:ascii="Calibri" w:cs="Calibri" w:eastAsia="Calibri" w:hAnsi="Calibri"/>
+          <w:b w:val="1"/>
+          <w:bCs w:val="1"/>
+          <w:sz w:val="24"/>
+          <w:szCs w:val="24"/>
+        </w:rPr>
+      </w:pPr>
+      <w:r>
+        <w:rPr>
+          <w:rFonts w:ascii="Calibri" w:cs="Calibri" w:eastAsia="Calibri" w:hAnsi="Calibri"/>
+          <w:b w:val="1"/>
+          <w:bCs w:val="1"/>
+          <w:sz w:val="24"/>
+          <w:szCs w:val="24"/>
+          <w:rtl w:val="0"/>
+        </w:rPr>
+        <w:t xml:space="preserve">Sr. Application Developer</w:t>
+        <w:br w:type="textWrapping"/>
+      </w:r>
+      <w:r>
+        <w:rPr>
+          <w:rFonts w:ascii="Calibri" w:cs="Calibri" w:eastAsia="Calibri" w:hAnsi="Calibri"/>
+          <w:sz w:val="24"/>
+          <w:szCs w:val="24"/>
+          <w:rtl w:val="0"/>
+        </w:rPr>
+        <w:t xml:space="preserve">February 2013 to January 2017 </w:t>
+      </w:r>
+      <w:r>
+        <w:rPr>
+          <w:rtl w:val="0"/>
+        </w:rPr>
+      </w:r>
+    </w:p>
+    <w:p>
+      <w:pPr>
+        <w:shd w:fill="eeece1" w:val="clear"/>
+        <w:tabs>
+          <w:tab w:val="center" w:leader="none" w:pos="-4770"/>
+        </w:tabs>
+        <w:ind w:left="180" w:right="-360" w:firstLine="0"/>
+        <w:jc w:val="center"/>
+        <w:rPr>
+          <w:rFonts w:ascii="Calibri" w:cs="Calibri" w:eastAsia="Calibri" w:hAnsi="Calibri"/>
+          <w:b w:val="1"/>
+          <w:bCs w:val="1"/>
+          <w:sz w:val="24"/>
+          <w:szCs w:val="24"/>
+        </w:rPr>
+      </w:pPr>
+      <w:r>
+        <w:rPr>
+          <w:rFonts w:ascii="Calibri" w:cs="Calibri" w:eastAsia="Calibri" w:hAnsi="Calibri"/>
+          <w:b w:val="1"/>
+          <w:bCs w:val="1"/>
+          <w:sz w:val="24"/>
+          <w:szCs w:val="24"/>
+          <w:rtl w:val="0"/>
+        </w:rPr>
+        <w:t xml:space="preserve">The Hanover Insurance Company, Worcester, Massachusetts</w:t>
+      </w:r>
+    </w:p>
+    <w:p>
+      <w:pPr>
+        <w:numPr>
+          <w:ilvl w:val="0"/>
+          <w:numId w:val="3"/>
+        </w:numPr>
+        <w:tabs>
           <w:tab w:val="left" w:leader="none" w:pos="-4860"/>
           <w:tab w:val="left" w:leader="none" w:pos="360"/>
         </w:tabs>
@@ -710,17 +806,16 @@
           <w:szCs w:val="24"/>
           <w:rtl w:val="0"/>
         </w:rPr>
-        <w:t xml:space="preserve">Refined permission &amp; role gating (restricted search, inventory linking visibility) enhancing security posture.</w:t>
-      </w:r>
-    </w:p>
-    <w:p>
-      <w:pPr>
-        <w:numPr>
-          <w:ilvl w:val="0"/>
-          <w:numId w:val="5"/>
-        </w:numPr>
-        <w:tabs>
-          <w:tab w:val="center" w:leader="none" w:pos="90"/>
+        <w:t xml:space="preserve">Engineered Java EE / Spring / Hibernate services &amp; UI components powering core insurance workflows.</w:t>
+      </w:r>
+    </w:p>
+    <w:p>
+      <w:pPr>
+        <w:numPr>
+          <w:ilvl w:val="0"/>
+          <w:numId w:val="3"/>
+        </w:numPr>
+        <w:tabs>
           <w:tab w:val="left" w:leader="none" w:pos="-4860"/>
           <w:tab w:val="left" w:leader="none" w:pos="360"/>
         </w:tabs>
@@ -739,15 +834,133 @@
           <w:szCs w:val="24"/>
           <w:rtl w:val="0"/>
         </w:rPr>
-        <w:t xml:space="preserve">Mentored engineers in code review, observability patterns, and sustainable refactoring practices.</w:t>
-      </w:r>
-    </w:p>
-    <w:p>
-      <w:pPr>
-        <w:ind w:right="-360"/>
+        <w:t xml:space="preserve">Co-led git adoption: branching strategy, review discipline; improved release stability.</w:t>
+      </w:r>
+    </w:p>
+    <w:p>
+      <w:pPr>
+        <w:numPr>
+          <w:ilvl w:val="0"/>
+          <w:numId w:val="3"/>
+        </w:numPr>
+        <w:tabs>
+          <w:tab w:val="left" w:leader="none" w:pos="-4860"/>
+          <w:tab w:val="left" w:leader="none" w:pos="360"/>
+        </w:tabs>
+        <w:ind w:left="720" w:right="-360" w:hanging="360"/>
+        <w:rPr>
+          <w:rFonts w:ascii="Calibri" w:cs="Calibri" w:eastAsia="Calibri" w:hAnsi="Calibri"/>
+          <w:sz w:val="24"/>
+          <w:szCs w:val="24"/>
+          <w:u w:val="none"/>
+        </w:rPr>
+      </w:pPr>
+      <w:r>
+        <w:rPr>
+          <w:rFonts w:ascii="Calibri" w:cs="Calibri" w:eastAsia="Calibri" w:hAnsi="Calibri"/>
+          <w:sz w:val="24"/>
+          <w:szCs w:val="24"/>
+          <w:rtl w:val="0"/>
+        </w:rPr>
+        <w:t xml:space="preserve">Optimized ORM &amp; SQL hotspots elevating responsiveness &amp; reliability under load.</w:t>
+      </w:r>
+    </w:p>
+    <w:p>
+      <w:pPr>
+        <w:numPr>
+          <w:ilvl w:val="0"/>
+          <w:numId w:val="3"/>
+        </w:numPr>
+        <w:tabs>
+          <w:tab w:val="left" w:leader="none" w:pos="-4860"/>
+          <w:tab w:val="left" w:leader="none" w:pos="360"/>
+        </w:tabs>
+        <w:ind w:left="720" w:right="-360" w:hanging="360"/>
+        <w:rPr>
+          <w:rFonts w:ascii="Calibri" w:cs="Calibri" w:eastAsia="Calibri" w:hAnsi="Calibri"/>
+          <w:sz w:val="24"/>
+          <w:szCs w:val="24"/>
+          <w:u w:val="none"/>
+        </w:rPr>
+      </w:pPr>
+      <w:r>
+        <w:rPr>
+          <w:rFonts w:ascii="Calibri" w:cs="Calibri" w:eastAsia="Calibri" w:hAnsi="Calibri"/>
+          <w:sz w:val="24"/>
+          <w:szCs w:val="24"/>
+          <w:rtl w:val="0"/>
+        </w:rPr>
+        <w:t xml:space="preserve">Introduced structured logging &amp; diagnostics accelerating root cause analysis.</w:t>
+      </w:r>
+    </w:p>
+    <w:p>
+      <w:pPr>
+        <w:numPr>
+          <w:ilvl w:val="0"/>
+          <w:numId w:val="3"/>
+        </w:numPr>
+        <w:tabs>
+          <w:tab w:val="left" w:leader="none" w:pos="-4860"/>
+          <w:tab w:val="left" w:leader="none" w:pos="360"/>
+        </w:tabs>
+        <w:ind w:left="720" w:right="-360" w:hanging="360"/>
+        <w:rPr>
+          <w:rFonts w:ascii="Calibri" w:cs="Calibri" w:eastAsia="Calibri" w:hAnsi="Calibri"/>
+          <w:sz w:val="24"/>
+          <w:szCs w:val="24"/>
+          <w:u w:val="none"/>
+        </w:rPr>
+      </w:pPr>
+      <w:r>
+        <w:rPr>
+          <w:rFonts w:ascii="Calibri" w:cs="Calibri" w:eastAsia="Calibri" w:hAnsi="Calibri"/>
+          <w:sz w:val="24"/>
+          <w:szCs w:val="24"/>
+          <w:rtl w:val="0"/>
+        </w:rPr>
+        <w:t xml:space="preserve">Extended Maven automation &amp; dependency management, standardizing delivery.</w:t>
+      </w:r>
+    </w:p>
+    <w:p>
+      <w:pPr>
+        <w:numPr>
+          <w:ilvl w:val="0"/>
+          <w:numId w:val="3"/>
+        </w:numPr>
+        <w:tabs>
+          <w:tab w:val="left" w:leader="none" w:pos="-4860"/>
+          <w:tab w:val="left" w:leader="none" w:pos="360"/>
+        </w:tabs>
+        <w:ind w:left="720" w:right="-360" w:hanging="360"/>
+        <w:rPr>
+          <w:rFonts w:ascii="Calibri" w:cs="Calibri" w:eastAsia="Calibri" w:hAnsi="Calibri"/>
+          <w:sz w:val="24"/>
+          <w:szCs w:val="24"/>
+          <w:u w:val="none"/>
+        </w:rPr>
+      </w:pPr>
+      <w:r>
+        <w:rPr>
+          <w:rFonts w:ascii="Calibri" w:cs="Calibri" w:eastAsia="Calibri" w:hAnsi="Calibri"/>
+          <w:sz w:val="24"/>
+          <w:szCs w:val="24"/>
+          <w:rtl w:val="0"/>
+        </w:rPr>
+        <w:t xml:space="preserve">Mentored peers on refactoring strategy &amp; maintainable design principles.</w:t>
+      </w:r>
+      <w:r>
+        <w:rPr>
+          <w:rtl w:val="0"/>
+        </w:rPr>
+      </w:r>
+    </w:p>
+    <w:p>
+      <w:pPr>
+        <w:ind w:left="180" w:right="-360" w:firstLine="0"/>
         <w:rPr>
           <w:rFonts w:ascii="Cambria" w:cs="Cambria" w:eastAsia="Cambria" w:hAnsi="Cambria"/>
           <w:b w:val="1"/>
+          <w:bCs w:val="1"/>
         </w:rPr>
       </w:pPr>
       <w:r>
@@ -767,19 +980,21 @@
         <w:rPr>
           <w:rFonts w:ascii="Calibri" w:cs="Calibri" w:eastAsia="Calibri" w:hAnsi="Calibri"/>
           <w:b w:val="1"/>
-          <w:sz w:val="24"/>
-          <w:szCs w:val="24"/>
-        </w:rPr>
-      </w:pPr>
-      <w:r>
-        <w:rPr>
-          <w:rFonts w:ascii="Calibri" w:cs="Calibri" w:eastAsia="Calibri" w:hAnsi="Calibri"/>
-          <w:b w:val="1"/>
-          <w:sz w:val="24"/>
-          <w:szCs w:val="24"/>
-          <w:rtl w:val="0"/>
-        </w:rPr>
-        <w:t xml:space="preserve">Sr. Application Developer</w:t>
+          <w:bCs w:val="1"/>
+          <w:sz w:val="24"/>
+          <w:szCs w:val="24"/>
+        </w:rPr>
+      </w:pPr>
+      <w:r>
+        <w:rPr>
+          <w:rFonts w:ascii="Calibri" w:cs="Calibri" w:eastAsia="Calibri" w:hAnsi="Calibri"/>
+          <w:b w:val="1"/>
+          <w:bCs w:val="1"/>
+          <w:sz w:val="24"/>
+          <w:szCs w:val="24"/>
+          <w:rtl w:val="0"/>
+        </w:rPr>
+        <w:t xml:space="preserve">Sr. Technical Analyst</w:t>
         <w:br w:type="textWrapping"/>
       </w:r>
       <w:r>
@@ -789,7 +1004,7 @@
           <w:szCs w:val="24"/>
           <w:rtl w:val="0"/>
         </w:rPr>
-        <w:t xml:space="preserve">February 2013 to January 2017 </w:t>
+        <w:t xml:space="preserve">November 2008 to February 2013</w:t>
       </w:r>
       <w:r>
         <w:rPr>
@@ -808,268 +1023,16 @@
         <w:rPr>
           <w:rFonts w:ascii="Calibri" w:cs="Calibri" w:eastAsia="Calibri" w:hAnsi="Calibri"/>
           <w:b w:val="1"/>
-          <w:sz w:val="24"/>
-          <w:szCs w:val="24"/>
-        </w:rPr>
-      </w:pPr>
-      <w:r>
-        <w:rPr>
-          <w:rFonts w:ascii="Calibri" w:cs="Calibri" w:eastAsia="Calibri" w:hAnsi="Calibri"/>
-          <w:b w:val="1"/>
-          <w:sz w:val="24"/>
-          <w:szCs w:val="24"/>
-          <w:rtl w:val="0"/>
-        </w:rPr>
-        <w:t xml:space="preserve">The Hanover Insurance Company, Worcester, Massachusetts</w:t>
-      </w:r>
-    </w:p>
-    <w:p>
-      <w:pPr>
-        <w:numPr>
-          <w:ilvl w:val="0"/>
-          <w:numId w:val="3"/>
-        </w:numPr>
-        <w:tabs>
-          <w:tab w:val="left" w:leader="none" w:pos="-4860"/>
-          <w:tab w:val="left" w:leader="none" w:pos="360"/>
-        </w:tabs>
-        <w:ind w:left="720" w:right="-360" w:hanging="360"/>
-        <w:rPr>
-          <w:rFonts w:ascii="Calibri" w:cs="Calibri" w:eastAsia="Calibri" w:hAnsi="Calibri"/>
-          <w:sz w:val="24"/>
-          <w:szCs w:val="24"/>
-          <w:u w:val="none"/>
-        </w:rPr>
-      </w:pPr>
-      <w:r>
-        <w:rPr>
-          <w:rFonts w:ascii="Calibri" w:cs="Calibri" w:eastAsia="Calibri" w:hAnsi="Calibri"/>
-          <w:sz w:val="24"/>
-          <w:szCs w:val="24"/>
-          <w:rtl w:val="0"/>
-        </w:rPr>
-        <w:t xml:space="preserve">Engineered Java EE / Spring / Hibernate services &amp; UI components powering core insurance workflows.</w:t>
-      </w:r>
-    </w:p>
-    <w:p>
-      <w:pPr>
-        <w:numPr>
-          <w:ilvl w:val="0"/>
-          <w:numId w:val="3"/>
-        </w:numPr>
-        <w:tabs>
-          <w:tab w:val="left" w:leader="none" w:pos="-4860"/>
-          <w:tab w:val="left" w:leader="none" w:pos="360"/>
-        </w:tabs>
-        <w:ind w:left="720" w:right="-360" w:hanging="360"/>
-        <w:rPr>
-          <w:rFonts w:ascii="Calibri" w:cs="Calibri" w:eastAsia="Calibri" w:hAnsi="Calibri"/>
-          <w:sz w:val="24"/>
-          <w:szCs w:val="24"/>
-          <w:u w:val="none"/>
-        </w:rPr>
-      </w:pPr>
-      <w:r>
-        <w:rPr>
-          <w:rFonts w:ascii="Calibri" w:cs="Calibri" w:eastAsia="Calibri" w:hAnsi="Calibri"/>
-          <w:sz w:val="24"/>
-          <w:szCs w:val="24"/>
-          <w:rtl w:val="0"/>
-        </w:rPr>
-        <w:t xml:space="preserve">Co-led git adoption: branching strategy, review discipline; improved release stability.</w:t>
-      </w:r>
-    </w:p>
-    <w:p>
-      <w:pPr>
-        <w:numPr>
-          <w:ilvl w:val="0"/>
-          <w:numId w:val="3"/>
-        </w:numPr>
-        <w:tabs>
-          <w:tab w:val="left" w:leader="none" w:pos="-4860"/>
-          <w:tab w:val="left" w:leader="none" w:pos="360"/>
-        </w:tabs>
-        <w:ind w:left="720" w:right="-360" w:hanging="360"/>
-        <w:rPr>
-          <w:rFonts w:ascii="Calibri" w:cs="Calibri" w:eastAsia="Calibri" w:hAnsi="Calibri"/>
-          <w:sz w:val="24"/>
-          <w:szCs w:val="24"/>
-          <w:u w:val="none"/>
-        </w:rPr>
-      </w:pPr>
-      <w:r>
-        <w:rPr>
-          <w:rFonts w:ascii="Calibri" w:cs="Calibri" w:eastAsia="Calibri" w:hAnsi="Calibri"/>
-          <w:sz w:val="24"/>
-          <w:szCs w:val="24"/>
-          <w:rtl w:val="0"/>
-        </w:rPr>
-        <w:t xml:space="preserve">Optimized ORM &amp; SQL hotspots elevating responsiveness &amp; reliability under load.</w:t>
-      </w:r>
-    </w:p>
-    <w:p>
-      <w:pPr>
-        <w:numPr>
-          <w:ilvl w:val="0"/>
-          <w:numId w:val="3"/>
-        </w:numPr>
-        <w:tabs>
-          <w:tab w:val="left" w:leader="none" w:pos="-4860"/>
-          <w:tab w:val="left" w:leader="none" w:pos="360"/>
-        </w:tabs>
-        <w:ind w:left="720" w:right="-360" w:hanging="360"/>
-        <w:rPr>
-          <w:rFonts w:ascii="Calibri" w:cs="Calibri" w:eastAsia="Calibri" w:hAnsi="Calibri"/>
-          <w:sz w:val="24"/>
-          <w:szCs w:val="24"/>
-          <w:u w:val="none"/>
-        </w:rPr>
-      </w:pPr>
-      <w:r>
-        <w:rPr>
-          <w:rFonts w:ascii="Calibri" w:cs="Calibri" w:eastAsia="Calibri" w:hAnsi="Calibri"/>
-          <w:sz w:val="24"/>
-          <w:szCs w:val="24"/>
-          <w:rtl w:val="0"/>
-        </w:rPr>
-        <w:t xml:space="preserve">Introduced structured logging &amp; diagnostics accelerating root cause analysis.</w:t>
-      </w:r>
-    </w:p>
-    <w:p>
-      <w:pPr>
-        <w:numPr>
-          <w:ilvl w:val="0"/>
-          <w:numId w:val="3"/>
-        </w:numPr>
-        <w:tabs>
-          <w:tab w:val="left" w:leader="none" w:pos="-4860"/>
-          <w:tab w:val="left" w:leader="none" w:pos="360"/>
-        </w:tabs>
-        <w:ind w:left="720" w:right="-360" w:hanging="360"/>
-        <w:rPr>
-          <w:rFonts w:ascii="Calibri" w:cs="Calibri" w:eastAsia="Calibri" w:hAnsi="Calibri"/>
-          <w:sz w:val="24"/>
-          <w:szCs w:val="24"/>
-          <w:u w:val="none"/>
-        </w:rPr>
-      </w:pPr>
-      <w:r>
-        <w:rPr>
-          <w:rFonts w:ascii="Calibri" w:cs="Calibri" w:eastAsia="Calibri" w:hAnsi="Calibri"/>
-          <w:sz w:val="24"/>
-          <w:szCs w:val="24"/>
-          <w:rtl w:val="0"/>
-        </w:rPr>
-        <w:t xml:space="preserve">Extended Maven automation &amp; dependency management, standardizing delivery.</w:t>
-      </w:r>
-    </w:p>
-    <w:p>
-      <w:pPr>
-        <w:numPr>
-          <w:ilvl w:val="0"/>
-          <w:numId w:val="3"/>
-        </w:numPr>
-        <w:tabs>
-          <w:tab w:val="left" w:leader="none" w:pos="-4860"/>
-          <w:tab w:val="left" w:leader="none" w:pos="360"/>
-        </w:tabs>
-        <w:ind w:left="720" w:right="-360" w:hanging="360"/>
-        <w:rPr>
-          <w:rFonts w:ascii="Calibri" w:cs="Calibri" w:eastAsia="Calibri" w:hAnsi="Calibri"/>
-          <w:sz w:val="24"/>
-          <w:szCs w:val="24"/>
-          <w:u w:val="none"/>
-        </w:rPr>
-      </w:pPr>
-      <w:r>
-        <w:rPr>
-          <w:rFonts w:ascii="Calibri" w:cs="Calibri" w:eastAsia="Calibri" w:hAnsi="Calibri"/>
-          <w:sz w:val="24"/>
-          <w:szCs w:val="24"/>
-          <w:rtl w:val="0"/>
-        </w:rPr>
-        <w:t xml:space="preserve">Mentored peers on refactoring strategy &amp; maintainable design principles.</w:t>
-      </w:r>
-      <w:r>
-        <w:rPr>
-          <w:rtl w:val="0"/>
-        </w:rPr>
-      </w:r>
-    </w:p>
-    <w:p>
-      <w:pPr>
-        <w:ind w:left="180" w:right="-360" w:firstLine="0"/>
-        <w:rPr>
-          <w:rFonts w:ascii="Cambria" w:cs="Cambria" w:eastAsia="Cambria" w:hAnsi="Cambria"/>
-          <w:b w:val="1"/>
-        </w:rPr>
-      </w:pPr>
-      <w:r>
-        <w:rPr>
-          <w:rtl w:val="0"/>
-        </w:rPr>
-      </w:r>
-    </w:p>
-    <w:p>
-      <w:pPr>
-        <w:shd w:fill="eeece1" w:val="clear"/>
-        <w:tabs>
-          <w:tab w:val="center" w:leader="none" w:pos="-4770"/>
-        </w:tabs>
-        <w:ind w:left="180" w:right="-360" w:firstLine="0"/>
-        <w:jc w:val="center"/>
-        <w:rPr>
-          <w:rFonts w:ascii="Calibri" w:cs="Calibri" w:eastAsia="Calibri" w:hAnsi="Calibri"/>
-          <w:b w:val="1"/>
-          <w:sz w:val="24"/>
-          <w:szCs w:val="24"/>
-        </w:rPr>
-      </w:pPr>
-      <w:r>
-        <w:rPr>
-          <w:rFonts w:ascii="Calibri" w:cs="Calibri" w:eastAsia="Calibri" w:hAnsi="Calibri"/>
-          <w:b w:val="1"/>
-          <w:sz w:val="24"/>
-          <w:szCs w:val="24"/>
-          <w:rtl w:val="0"/>
-        </w:rPr>
-        <w:t xml:space="preserve">Sr. Technical Analyst</w:t>
-        <w:br w:type="textWrapping"/>
-      </w:r>
-      <w:r>
-        <w:rPr>
-          <w:rFonts w:ascii="Calibri" w:cs="Calibri" w:eastAsia="Calibri" w:hAnsi="Calibri"/>
-          <w:sz w:val="24"/>
-          <w:szCs w:val="24"/>
-          <w:rtl w:val="0"/>
-        </w:rPr>
-        <w:t xml:space="preserve">November 2008 to February 2013</w:t>
-      </w:r>
-      <w:r>
-        <w:rPr>
-          <w:rtl w:val="0"/>
-        </w:rPr>
-      </w:r>
-    </w:p>
-    <w:p>
-      <w:pPr>
-        <w:shd w:fill="eeece1" w:val="clear"/>
-        <w:tabs>
-          <w:tab w:val="center" w:leader="none" w:pos="-4770"/>
-        </w:tabs>
-        <w:ind w:left="180" w:right="-360" w:firstLine="0"/>
-        <w:jc w:val="center"/>
-        <w:rPr>
-          <w:rFonts w:ascii="Calibri" w:cs="Calibri" w:eastAsia="Calibri" w:hAnsi="Calibri"/>
-          <w:b w:val="1"/>
-          <w:sz w:val="24"/>
-          <w:szCs w:val="24"/>
-        </w:rPr>
-      </w:pPr>
-      <w:r>
-        <w:rPr>
-          <w:rFonts w:ascii="Calibri" w:cs="Calibri" w:eastAsia="Calibri" w:hAnsi="Calibri"/>
-          <w:b w:val="1"/>
+          <w:bCs w:val="1"/>
+          <w:sz w:val="24"/>
+          <w:szCs w:val="24"/>
+        </w:rPr>
+      </w:pPr>
+      <w:r>
+        <w:rPr>
+          <w:rFonts w:ascii="Calibri" w:cs="Calibri" w:eastAsia="Calibri" w:hAnsi="Calibri"/>
+          <w:b w:val="1"/>
+          <w:bCs w:val="1"/>
           <w:sz w:val="24"/>
           <w:szCs w:val="24"/>
           <w:rtl w:val="0"/>
@@ -1105,7 +1068,9 @@
         <w:rPr>
           <w:rFonts w:ascii="Calibri" w:cs="Calibri" w:eastAsia="Calibri" w:hAnsi="Calibri"/>
           <w:b w:val="0"/>
+          <w:bCs w:val="0"/>
           <w:i w:val="0"/>
+          <w:iCs w:val="0"/>
           <w:smallCaps w:val="0"/>
           <w:strike w:val="0"/>
           <w:color w:val="000000"/>
@@ -1154,7 +1119,9 @@
         <w:rPr>
           <w:rFonts w:ascii="Calibri" w:cs="Calibri" w:eastAsia="Calibri" w:hAnsi="Calibri"/>
           <w:b w:val="0"/>
+          <w:bCs w:val="0"/>
           <w:i w:val="0"/>
+          <w:iCs w:val="0"/>
           <w:smallCaps w:val="0"/>
           <w:strike w:val="0"/>
           <w:color w:val="000000"/>
@@ -1203,7 +1170,9 @@
         <w:rPr>
           <w:rFonts w:ascii="Calibri" w:cs="Calibri" w:eastAsia="Calibri" w:hAnsi="Calibri"/>
           <w:b w:val="0"/>
+          <w:bCs w:val="0"/>
           <w:i w:val="0"/>
+          <w:iCs w:val="0"/>
           <w:smallCaps w:val="0"/>
           <w:strike w:val="0"/>
           <w:color w:val="000000"/>
@@ -1252,7 +1221,9 @@
         <w:rPr>
           <w:rFonts w:ascii="Calibri" w:cs="Calibri" w:eastAsia="Calibri" w:hAnsi="Calibri"/>
           <w:b w:val="0"/>
+          <w:bCs w:val="0"/>
           <w:i w:val="0"/>
+          <w:iCs w:val="0"/>
           <w:smallCaps w:val="0"/>
           <w:strike w:val="0"/>
           <w:color w:val="000000"/>
@@ -1301,7 +1272,9 @@
         <w:rPr>
           <w:rFonts w:ascii="Calibri" w:cs="Calibri" w:eastAsia="Calibri" w:hAnsi="Calibri"/>
           <w:b w:val="0"/>
+          <w:bCs w:val="0"/>
           <w:i w:val="0"/>
+          <w:iCs w:val="0"/>
           <w:smallCaps w:val="0"/>
           <w:strike w:val="0"/>
           <w:color w:val="000000"/>
@@ -1350,7 +1323,9 @@
         <w:rPr>
           <w:rFonts w:ascii="Calibri" w:cs="Calibri" w:eastAsia="Calibri" w:hAnsi="Calibri"/>
           <w:b w:val="0"/>
+          <w:bCs w:val="0"/>
           <w:i w:val="0"/>
+          <w:iCs w:val="0"/>
           <w:smallCaps w:val="0"/>
           <w:strike w:val="0"/>
           <w:color w:val="000000"/>
@@ -1405,14 +1380,16 @@
         <w:rPr>
           <w:rFonts w:ascii="Calibri" w:cs="Calibri" w:eastAsia="Calibri" w:hAnsi="Calibri"/>
           <w:b w:val="1"/>
-          <w:sz w:val="24"/>
-          <w:szCs w:val="24"/>
-        </w:rPr>
-      </w:pPr>
-      <w:r>
-        <w:rPr>
-          <w:rFonts w:ascii="Calibri" w:cs="Calibri" w:eastAsia="Calibri" w:hAnsi="Calibri"/>
-          <w:b w:val="1"/>
+          <w:bCs w:val="1"/>
+          <w:sz w:val="24"/>
+          <w:szCs w:val="24"/>
+        </w:rPr>
+      </w:pPr>
+      <w:r>
+        <w:rPr>
+          <w:rFonts w:ascii="Calibri" w:cs="Calibri" w:eastAsia="Calibri" w:hAnsi="Calibri"/>
+          <w:b w:val="1"/>
+          <w:bCs w:val="1"/>
           <w:sz w:val="24"/>
           <w:szCs w:val="24"/>
           <w:rtl w:val="0"/>
@@ -1455,14 +1432,16 @@
         <w:rPr>
           <w:rFonts w:ascii="Calibri" w:cs="Calibri" w:eastAsia="Calibri" w:hAnsi="Calibri"/>
           <w:b w:val="1"/>
-          <w:sz w:val="24"/>
-          <w:szCs w:val="24"/>
-        </w:rPr>
-      </w:pPr>
-      <w:r>
-        <w:rPr>
-          <w:rFonts w:ascii="Calibri" w:cs="Calibri" w:eastAsia="Calibri" w:hAnsi="Calibri"/>
-          <w:b w:val="1"/>
+          <w:bCs w:val="1"/>
+          <w:sz w:val="24"/>
+          <w:szCs w:val="24"/>
+        </w:rPr>
+      </w:pPr>
+      <w:r>
+        <w:rPr>
+          <w:rFonts w:ascii="Calibri" w:cs="Calibri" w:eastAsia="Calibri" w:hAnsi="Calibri"/>
+          <w:b w:val="1"/>
+          <w:bCs w:val="1"/>
           <w:sz w:val="24"/>
           <w:szCs w:val="24"/>
           <w:rtl w:val="0"/>
@@ -1498,7 +1477,9 @@
         <w:rPr>
           <w:rFonts w:ascii="Calibri" w:cs="Calibri" w:eastAsia="Calibri" w:hAnsi="Calibri"/>
           <w:b w:val="0"/>
+          <w:bCs w:val="0"/>
           <w:i w:val="0"/>
+          <w:iCs w:val="0"/>
           <w:smallCaps w:val="0"/>
           <w:strike w:val="0"/>
           <w:color w:val="000000"/>
@@ -1513,7 +1494,9 @@
         <w:rPr>
           <w:rFonts w:ascii="Calibri" w:cs="Calibri" w:eastAsia="Calibri" w:hAnsi="Calibri"/>
           <w:b w:val="0"/>
+          <w:bCs w:val="0"/>
           <w:i w:val="0"/>
+          <w:iCs w:val="0"/>
           <w:smallCaps w:val="0"/>
           <w:strike w:val="0"/>
           <w:color w:val="000000"/>
@@ -1555,7 +1538,9 @@
         <w:rPr>
           <w:rFonts w:ascii="Calibri" w:cs="Calibri" w:eastAsia="Calibri" w:hAnsi="Calibri"/>
           <w:b w:val="0"/>
+          <w:bCs w:val="0"/>
           <w:i w:val="0"/>
+          <w:iCs w:val="0"/>
           <w:smallCaps w:val="0"/>
           <w:strike w:val="0"/>
           <w:color w:val="000000"/>
@@ -1570,7 +1555,9 @@
         <w:rPr>
           <w:rFonts w:ascii="Calibri" w:cs="Calibri" w:eastAsia="Calibri" w:hAnsi="Calibri"/>
           <w:b w:val="0"/>
+          <w:bCs w:val="0"/>
           <w:i w:val="0"/>
+          <w:iCs w:val="0"/>
           <w:smallCaps w:val="0"/>
           <w:strike w:val="0"/>
           <w:color w:val="000000"/>
@@ -1627,12 +1614,14 @@
         <w:rPr>
           <w:rFonts w:ascii="Cambria" w:cs="Cambria" w:eastAsia="Cambria" w:hAnsi="Cambria"/>
           <w:b w:val="1"/>
+          <w:bCs w:val="1"/>
         </w:rPr>
       </w:pPr>
       <w:r>
         <w:rPr>
           <w:rFonts w:ascii="Cambria" w:cs="Cambria" w:eastAsia="Cambria" w:hAnsi="Cambria"/>
           <w:b w:val="1"/>
+          <w:bCs w:val="1"/>
           <w:rtl w:val="0"/>
         </w:rPr>
         <w:t xml:space="preserve">EDUCATION:</w:t>
@@ -1649,14 +1638,16 @@
         <w:rPr>
           <w:rFonts w:ascii="Calibri" w:cs="Calibri" w:eastAsia="Calibri" w:hAnsi="Calibri"/>
           <w:b w:val="1"/>
-          <w:sz w:val="24"/>
-          <w:szCs w:val="24"/>
-        </w:rPr>
-      </w:pPr>
-      <w:r>
-        <w:rPr>
-          <w:rFonts w:ascii="Calibri" w:cs="Calibri" w:eastAsia="Calibri" w:hAnsi="Calibri"/>
-          <w:b w:val="1"/>
+          <w:bCs w:val="1"/>
+          <w:sz w:val="24"/>
+          <w:szCs w:val="24"/>
+        </w:rPr>
+      </w:pPr>
+      <w:r>
+        <w:rPr>
+          <w:rFonts w:ascii="Calibri" w:cs="Calibri" w:eastAsia="Calibri" w:hAnsi="Calibri"/>
+          <w:b w:val="1"/>
+          <w:bCs w:val="1"/>
           <w:sz w:val="24"/>
           <w:szCs w:val="24"/>
           <w:rtl w:val="0"/>
@@ -1697,6 +1688,7 @@
         <w:rPr>
           <w:rFonts w:ascii="Calibri" w:cs="Calibri" w:eastAsia="Calibri" w:hAnsi="Calibri"/>
           <w:b w:val="1"/>
+          <w:bCs w:val="1"/>
           <w:sz w:val="24"/>
           <w:szCs w:val="24"/>
           <w:rtl w:val="0"/>
@@ -1763,6 +1755,7 @@
         <w:rPr>
           <w:rFonts w:ascii="Cambria" w:cs="Cambria" w:eastAsia="Cambria" w:hAnsi="Cambria"/>
           <w:b w:val="1"/>
+          <w:bCs w:val="1"/>
           <w:rtl w:val="0"/>
         </w:rPr>
         <w:t xml:space="preserve">TECHNICAL SKILLS</w:t>
@@ -1791,6 +1784,7 @@
         <w:rPr>
           <w:rFonts w:ascii="Calibri" w:cs="Calibri" w:eastAsia="Calibri" w:hAnsi="Calibri"/>
           <w:b w:val="1"/>
+          <w:bCs w:val="1"/>
           <w:sz w:val="24"/>
           <w:szCs w:val="24"/>
           <w:rtl w:val="0"/>
@@ -1825,6 +1819,7 @@
         <w:rPr>
           <w:rFonts w:ascii="Calibri" w:cs="Calibri" w:eastAsia="Calibri" w:hAnsi="Calibri"/>
           <w:b w:val="1"/>
+          <w:bCs w:val="1"/>
           <w:sz w:val="24"/>
           <w:szCs w:val="24"/>
           <w:rtl w:val="0"/>
@@ -1838,7 +1833,7 @@
           <w:szCs w:val="24"/>
           <w:rtl w:val="0"/>
         </w:rPr>
-        <w:t xml:space="preserve"> .NET / ASP.NET MVC &amp; Web API, React, Node.js, Spring, Hibernate, MSTest, xUnit, Bootstrap, jQuery</w:t>
+        <w:t xml:space="preserve"> .NET / ASP.NET MVC &amp; Web API, React, Node.js, Entity Framework, Spring, Hibernate, MSTest, xUnit, Bootstrap, jQuery</w:t>
       </w:r>
     </w:p>
     <w:p>
@@ -1859,6 +1854,7 @@
         <w:rPr>
           <w:rFonts w:ascii="Calibri" w:cs="Calibri" w:eastAsia="Calibri" w:hAnsi="Calibri"/>
           <w:b w:val="1"/>
+          <w:bCs w:val="1"/>
           <w:sz w:val="24"/>
           <w:szCs w:val="24"/>
           <w:rtl w:val="0"/>
@@ -1893,6 +1889,7 @@
         <w:rPr>
           <w:rFonts w:ascii="Calibri" w:cs="Calibri" w:eastAsia="Calibri" w:hAnsi="Calibri"/>
           <w:b w:val="1"/>
+          <w:bCs w:val="1"/>
           <w:sz w:val="24"/>
           <w:szCs w:val="24"/>
           <w:rtl w:val="0"/>
@@ -1927,6 +1924,7 @@
         <w:rPr>
           <w:rFonts w:ascii="Calibri" w:cs="Calibri" w:eastAsia="Calibri" w:hAnsi="Calibri"/>
           <w:b w:val="1"/>
+          <w:bCs w:val="1"/>
           <w:sz w:val="24"/>
           <w:szCs w:val="24"/>
           <w:rtl w:val="0"/>
@@ -1961,6 +1959,7 @@
         <w:rPr>
           <w:rFonts w:ascii="Calibri" w:cs="Calibri" w:eastAsia="Calibri" w:hAnsi="Calibri"/>
           <w:b w:val="1"/>
+          <w:bCs w:val="1"/>
           <w:sz w:val="24"/>
           <w:szCs w:val="24"/>
           <w:rtl w:val="0"/>
@@ -1995,6 +1994,7 @@
         <w:rPr>
           <w:rFonts w:ascii="Calibri" w:cs="Calibri" w:eastAsia="Calibri" w:hAnsi="Calibri"/>
           <w:b w:val="1"/>
+          <w:bCs w:val="1"/>
           <w:sz w:val="24"/>
           <w:szCs w:val="24"/>
           <w:rtl w:val="0"/>
@@ -2029,6 +2029,7 @@
         <w:rPr>
           <w:rFonts w:ascii="Calibri" w:cs="Calibri" w:eastAsia="Calibri" w:hAnsi="Calibri"/>
           <w:b w:val="1"/>
+          <w:bCs w:val="1"/>
           <w:sz w:val="24"/>
           <w:szCs w:val="24"/>
           <w:rtl w:val="0"/>
@@ -2063,6 +2064,7 @@
         <w:rPr>
           <w:rFonts w:ascii="Calibri" w:cs="Calibri" w:eastAsia="Calibri" w:hAnsi="Calibri"/>
           <w:b w:val="1"/>
+          <w:bCs w:val="1"/>
           <w:sz w:val="24"/>
           <w:szCs w:val="24"/>
           <w:rtl w:val="0"/>
@@ -2097,6 +2099,7 @@
         <w:rPr>
           <w:rFonts w:ascii="Calibri" w:cs="Calibri" w:eastAsia="Calibri" w:hAnsi="Calibri"/>
           <w:b w:val="1"/>
+          <w:bCs w:val="1"/>
           <w:sz w:val="24"/>
           <w:szCs w:val="24"/>
           <w:rtl w:val="0"/>
@@ -2131,6 +2134,7 @@
         <w:rPr>
           <w:rFonts w:ascii="Calibri" w:cs="Calibri" w:eastAsia="Calibri" w:hAnsi="Calibri"/>
           <w:b w:val="1"/>
+          <w:bCs w:val="1"/>
           <w:sz w:val="24"/>
           <w:szCs w:val="24"/>
           <w:rtl w:val="0"/>
@@ -2165,6 +2169,7 @@
         <w:rPr>
           <w:rFonts w:ascii="Calibri" w:cs="Calibri" w:eastAsia="Calibri" w:hAnsi="Calibri"/>
           <w:b w:val="1"/>
+          <w:bCs w:val="1"/>
           <w:sz w:val="24"/>
           <w:szCs w:val="24"/>
           <w:rtl w:val="0"/>
@@ -2199,6 +2204,7 @@
         <w:rPr>
           <w:rFonts w:ascii="Calibri" w:cs="Calibri" w:eastAsia="Calibri" w:hAnsi="Calibri"/>
           <w:b w:val="1"/>
+          <w:bCs w:val="1"/>
           <w:sz w:val="24"/>
           <w:szCs w:val="24"/>
           <w:rtl w:val="0"/>
@@ -2233,6 +2239,7 @@
         <w:rPr>
           <w:rFonts w:ascii="Calibri" w:cs="Calibri" w:eastAsia="Calibri" w:hAnsi="Calibri"/>
           <w:b w:val="1"/>
+          <w:bCs w:val="1"/>
           <w:sz w:val="24"/>
           <w:szCs w:val="24"/>
           <w:rtl w:val="0"/>
@@ -2866,6 +2873,7 @@
     </w:pPr>
     <w:rPr>
       <w:b w:val="1"/>
+      <w:bCs w:val="1"/>
       <w:sz w:val="48"/>
       <w:szCs w:val="48"/>
     </w:rPr>
@@ -2882,6 +2890,7 @@
     </w:pPr>
     <w:rPr>
       <w:b w:val="1"/>
+      <w:bCs w:val="1"/>
       <w:sz w:val="36"/>
       <w:szCs w:val="36"/>
     </w:rPr>
@@ -2898,6 +2907,7 @@
     </w:pPr>
     <w:rPr>
       <w:b w:val="1"/>
+      <w:bCs w:val="1"/>
       <w:sz w:val="28"/>
       <w:szCs w:val="28"/>
     </w:rPr>
@@ -2914,6 +2924,7 @@
     </w:pPr>
     <w:rPr>
       <w:b w:val="1"/>
+      <w:bCs w:val="1"/>
       <w:sz w:val="24"/>
       <w:szCs w:val="24"/>
     </w:rPr>
@@ -2930,6 +2941,7 @@
     </w:pPr>
     <w:rPr>
       <w:b w:val="1"/>
+      <w:bCs w:val="1"/>
       <w:sz w:val="22"/>
       <w:szCs w:val="22"/>
     </w:rPr>
@@ -2946,6 +2958,7 @@
     </w:pPr>
     <w:rPr>
       <w:b w:val="1"/>
+      <w:bCs w:val="1"/>
       <w:sz w:val="20"/>
       <w:szCs w:val="20"/>
     </w:rPr>
@@ -2962,6 +2975,7 @@
     </w:pPr>
     <w:rPr>
       <w:b w:val="1"/>
+      <w:bCs w:val="1"/>
       <w:sz w:val="72"/>
       <w:szCs w:val="72"/>
     </w:rPr>
@@ -3205,6 +3219,7 @@
     <w:rPr>
       <w:rFonts w:ascii="Georgia" w:cs="Georgia" w:eastAsia="Georgia" w:hAnsi="Georgia"/>
       <w:i w:val="1"/>
+      <w:iCs w:val="1"/>
       <w:color w:val="666666"/>
       <w:sz w:val="48"/>
       <w:szCs w:val="48"/>

</xml_diff>